<commit_message>
docs: add real-world Taiwan Administrative Law HTML & Podcast Prompt templates and input/output comparison tables
</commit_message>
<xml_diff>
--- a/Antigravity_AI全方位實戰指南_HTML簡報與網頁Podcast產製講義_完整Prompt版.docx
+++ b/Antigravity_AI全方位實戰指南_HTML簡報與網頁Podcast產製講義_完整Prompt版.docx
@@ -81,7 +81,9 @@
                 <w:color w:val="2D3748"/>
                 <w:sz w:val="20"/>
               </w:rPr>
-              <w:t>本教學手冊專為 Antigravity AI 人工智慧協作系統的初學者所編寫。全書以「行政法 500 頁旗艦簡報與 30 分鐘雙主持廣播 Podcast」專案為真實範例，手把手引導學員掌握如何透過自然語言與 Antigravity AI 進行雙人對話（Pair Programming）、需求定義、自動化程式碼編寫、音訊合成、自動化測試與 GitHub 雲端部署。本手冊內含全部 7 大階段完整複製即用的 Antigravity Prompt 提示詞模板指令，學員可以直接複製貼上複製操作！</w:t>
+              <w:t>本教學手冊專為 Antigravity AI 人工智慧協作系統的初學者所編寫。全書以「行政法 500 頁旗艦簡報與 30 分鐘雙主持廣播 Podcast」專案為真實範例，手把手引導學員掌握如何透過自然語言與 Antigravity AI 進行雙人對話（Pair Programming）、需求定義、自動化程式碼編寫、音訊合成、自動化測試與 GitHub 雲端部署。</w:t>
+              <w:br/>
+              <w:t>特別強化版：手冊內含有完整的行政法 HTML 簡報開發與 Podcast 影音製作範例 Prompt 模板，並提供『輸入 Prompt -&gt; AI 軌跡 -&gt; 輸出檔案』的具體比對說明與 Python Matplotlib 實測架構圖表！</w:t>
             </w:r>
           </w:p>
         </w:tc>
@@ -595,21 +597,6 @@
     </w:p>
     <w:p>
       <w:pPr>
-        <w:keepNext/>
-        <w:spacing w:before="360" w:after="160"/>
-      </w:pPr>
-      <w:r>
-        <w:rPr>
-          <w:rFonts w:ascii="Microsoft JhengHei" w:hAnsi="Microsoft JhengHei"/>
-          <w:b/>
-          <w:color w:val="2C5282"/>
-          <w:sz w:val="27"/>
-        </w:rPr>
-        <w:t>1.2 人機 Pair Programming（雙人對話協作）的核心原則</w:t>
-      </w:r>
-    </w:p>
-    <w:p>
-      <w:pPr>
         <w:spacing w:after="140" w:line="300" w:lineRule="auto"/>
       </w:pPr>
       <w:r>
@@ -618,51 +605,7 @@
           <w:color w:val="2D3748"/>
           <w:sz w:val="22"/>
         </w:rPr>
-        <w:t>要在大型專案中獲得最佳成果，使用者必須掌握 Pair Programming 的雙人角色分工：</w:t>
-      </w:r>
-    </w:p>
-    <w:p>
-      <w:pPr>
-        <w:pStyle w:val="ListBullet"/>
-        <w:spacing w:after="80" w:line="288" w:lineRule="auto"/>
-      </w:pPr>
-      <w:r>
-        <w:rPr>
-          <w:rFonts w:ascii="Microsoft JhengHei" w:hAnsi="Microsoft JhengHei"/>
-          <w:b/>
-          <w:color w:val="1B365D"/>
-        </w:rPr>
-        <w:t>使用者角色：</w:t>
-      </w:r>
-      <w:r>
-        <w:rPr>
-          <w:rFonts w:ascii="Microsoft JhengHei" w:hAnsi="Microsoft JhengHei"/>
-          <w:color w:val="2D3748"/>
-          <w:sz w:val="21"/>
-        </w:rPr>
-        <w:t>使用者（User）擔任「產品經理 (PM)」與「架構審查者」：負責提出明確業務需求、驗收標準與視覺美感偏好。</w:t>
-      </w:r>
-    </w:p>
-    <w:p>
-      <w:pPr>
-        <w:pStyle w:val="ListBullet"/>
-        <w:spacing w:after="80" w:line="288" w:lineRule="auto"/>
-      </w:pPr>
-      <w:r>
-        <w:rPr>
-          <w:rFonts w:ascii="Microsoft JhengHei" w:hAnsi="Microsoft JhengHei"/>
-          <w:b/>
-          <w:color w:val="1B365D"/>
-        </w:rPr>
-        <w:t>AI 角色：</w:t>
-      </w:r>
-      <w:r>
-        <w:rPr>
-          <w:rFonts w:ascii="Microsoft JhengHei" w:hAnsi="Microsoft JhengHei"/>
-          <w:color w:val="2D3748"/>
-          <w:sz w:val="21"/>
-        </w:rPr>
-        <w:t>Antigravity AI 擔任「首席工程師」與「執行團隊」：負責底層架構設計、代碼撰寫、重構與自動化驗證。</w:t>
+        <w:t>在傳統模式下，程式設計師需要手動開啟編輯器、建立資料夾、撰寫程式碼、處理套件安裝、並手動開啟瀏覽器測試。而在 Antigravity 代理模式下，AI 能夠直接讀取整個專案的目錄結構，獨立調用 Python 或 Node.js 執行檔，甚至能夠自己撰寫測試腳本對產出物進行連環稽核！</w:t>
       </w:r>
     </w:p>
     <w:p>
@@ -677,7 +620,843 @@
           <w:color w:val="2C5282"/>
           <w:sz w:val="27"/>
         </w:rPr>
-        <w:t>1.3 提示詞（Prompt）撰寫黃金公式（4W1H 公式）</w:t>
+        <w:t>1.2 提示詞（Prompt）撰寫黃金公式（4W1H 公式）與代理人執行架構圖</w:t>
+      </w:r>
+    </w:p>
+    <w:p>
+      <w:pPr>
+        <w:spacing w:after="140" w:line="300" w:lineRule="auto"/>
+      </w:pPr>
+      <w:r>
+        <w:rPr>
+          <w:rFonts w:ascii="Microsoft JhengHei" w:hAnsi="Microsoft JhengHei"/>
+          <w:color w:val="2D3748"/>
+          <w:sz w:val="22"/>
+        </w:rPr>
+        <w:t>為了讓初學者能夠精準控制 Antigravity AI 的思考方向，我們歸納出 4W1H 提示詞黃金公式。以下為 4W1H 各要件在 AI 代理人內部運算時所觸發的關鍵機制：</w:t>
+      </w:r>
+    </w:p>
+    <w:p>
+      <w:pPr>
+        <w:spacing w:before="200" w:after="80"/>
+        <w:jc w:val="center"/>
+      </w:pPr>
+      <w:r>
+        <w:drawing>
+          <wp:inline xmlns:a="http://schemas.openxmlformats.org/drawingml/2006/main" xmlns:pic="http://schemas.openxmlformats.org/drawingml/2006/picture">
+            <wp:extent cx="5669280" cy="2534502"/>
+            <wp:docPr id="1" name="Picture 1"/>
+            <wp:cNvGraphicFramePr>
+              <a:graphicFrameLocks noChangeAspect="1"/>
+            </wp:cNvGraphicFramePr>
+            <a:graphic>
+              <a:graphicData uri="http://schemas.openxmlformats.org/drawingml/2006/picture">
+                <pic:pic>
+                  <pic:nvPicPr>
+                    <pic:cNvPr id="0" name="prompt_4w1h_architecture.png"/>
+                    <pic:cNvPicPr/>
+                  </pic:nvPicPr>
+                  <pic:blipFill>
+                    <a:blip r:embed="rId9"/>
+                    <a:stretch>
+                      <a:fillRect/>
+                    </a:stretch>
+                  </pic:blipFill>
+                  <pic:spPr>
+                    <a:xfrm>
+                      <a:off x="0" y="0"/>
+                      <a:ext cx="5669280" cy="2534502"/>
+                    </a:xfrm>
+                    <a:prstGeom prst="rect"/>
+                  </pic:spPr>
+                </pic:pic>
+              </a:graphicData>
+            </a:graphic>
+          </wp:inline>
+        </w:drawing>
+      </w:r>
+    </w:p>
+    <w:p>
+      <w:pPr>
+        <w:spacing w:after="200"/>
+        <w:jc w:val="center"/>
+      </w:pPr>
+      <w:r>
+        <w:rPr>
+          <w:rFonts w:ascii="Microsoft JhengHei" w:hAnsi="Microsoft JhengHei"/>
+          <w:i/>
+          <w:color w:val="2C5282"/>
+          <w:sz w:val="19"/>
+        </w:rPr>
+        <w:t>圖 1.1：Antigravity AI 提示詞 (Prompt) 4W1H 黃金公式與代理人執行架構圖</w:t>
+      </w:r>
+    </w:p>
+    <w:p>
+      <w:pPr>
+        <w:keepNext/>
+        <w:spacing w:before="280" w:after="120"/>
+      </w:pPr>
+      <w:r>
+        <w:rPr>
+          <w:rFonts w:ascii="Microsoft JhengHei" w:hAnsi="Microsoft JhengHei"/>
+          <w:b/>
+          <w:color w:val="D97706"/>
+          <w:sz w:val="24"/>
+        </w:rPr>
+        <w:t>4W1H 各參數解說與內部意義：</w:t>
+      </w:r>
+    </w:p>
+    <w:p>
+      <w:pPr>
+        <w:pStyle w:val="ListBullet"/>
+        <w:spacing w:after="80" w:line="288" w:lineRule="auto"/>
+      </w:pPr>
+      <w:r>
+        <w:rPr>
+          <w:rFonts w:ascii="Microsoft JhengHei" w:hAnsi="Microsoft JhengHei"/>
+          <w:b/>
+          <w:color w:val="1B365D"/>
+        </w:rPr>
+        <w:t>1. WHO (角色定義)：</w:t>
+      </w:r>
+      <w:r>
+        <w:rPr>
+          <w:rFonts w:ascii="Microsoft JhengHei" w:hAnsi="Microsoft JhengHei"/>
+          <w:color w:val="2D3748"/>
+          <w:sz w:val="21"/>
+        </w:rPr>
+        <w:t>指定 AI 的專業角色（例如：Web 前端架構師或法學教授）。這會激活大語言模型（LLM）權重庫中特定專業領域的代碼模式與專有名詞庫，避免產生外行程式碼。</w:t>
+      </w:r>
+    </w:p>
+    <w:p>
+      <w:pPr>
+        <w:pStyle w:val="ListBullet"/>
+        <w:spacing w:after="80" w:line="288" w:lineRule="auto"/>
+      </w:pPr>
+      <w:r>
+        <w:rPr>
+          <w:rFonts w:ascii="Microsoft JhengHei" w:hAnsi="Microsoft JhengHei"/>
+          <w:b/>
+          <w:color w:val="1B365D"/>
+        </w:rPr>
+        <w:t>2. WHAT (目標產物)：</w:t>
+      </w:r>
+      <w:r>
+        <w:rPr>
+          <w:rFonts w:ascii="Microsoft JhengHei" w:hAnsi="Microsoft JhengHei"/>
+          <w:color w:val="2D3748"/>
+          <w:sz w:val="21"/>
+        </w:rPr>
+        <w:t>明確定義最終產出物的檔名、副檔名與規格（例如：index.html 或 .mp3）。這能防止 AI 僅在對話框中印出未格式化的純文字片段，而強制其寫入實體檔案。</w:t>
+      </w:r>
+    </w:p>
+    <w:p>
+      <w:pPr>
+        <w:pStyle w:val="ListBullet"/>
+        <w:spacing w:after="80" w:line="288" w:lineRule="auto"/>
+      </w:pPr>
+      <w:r>
+        <w:rPr>
+          <w:rFonts w:ascii="Microsoft JhengHei" w:hAnsi="Microsoft JhengHei"/>
+          <w:b/>
+          <w:color w:val="1B365D"/>
+        </w:rPr>
+        <w:t>3. WHERE (儲存路徑)：</w:t>
+      </w:r>
+      <w:r>
+        <w:rPr>
+          <w:rFonts w:ascii="Microsoft JhengHei" w:hAnsi="Microsoft JhengHei"/>
+          <w:color w:val="2D3748"/>
+          <w:sz w:val="21"/>
+        </w:rPr>
+        <w:t>指定檔案的存放路徑（例如：專案根目錄或 scratch/ 沙盒區）。這能規範 AI 的檔案存取權限，防止 AI 在系統隨機目錄建立臨時垃圾檔。</w:t>
+      </w:r>
+    </w:p>
+    <w:p>
+      <w:pPr>
+        <w:pStyle w:val="ListBullet"/>
+        <w:spacing w:after="80" w:line="288" w:lineRule="auto"/>
+      </w:pPr>
+      <w:r>
+        <w:rPr>
+          <w:rFonts w:ascii="Microsoft JhengHei" w:hAnsi="Microsoft JhengHei"/>
+          <w:b/>
+          <w:color w:val="1B365D"/>
+        </w:rPr>
+        <w:t>4. WHY (業務情境)：</w:t>
+      </w:r>
+      <w:r>
+        <w:rPr>
+          <w:rFonts w:ascii="Microsoft JhengHei" w:hAnsi="Microsoft JhengHei"/>
+          <w:color w:val="2D3748"/>
+          <w:sz w:val="21"/>
+        </w:rPr>
+        <w:t>說明產品的使用對象與背景脈絡（例如：108 課綱與臺灣行政法）。這能防範 AI 產生不符當地法規（如誤用中國大陸或外國法規）的幻覺。</w:t>
+      </w:r>
+    </w:p>
+    <w:p>
+      <w:pPr>
+        <w:pStyle w:val="ListBullet"/>
+        <w:spacing w:after="80" w:line="288" w:lineRule="auto"/>
+      </w:pPr>
+      <w:r>
+        <w:rPr>
+          <w:rFonts w:ascii="Microsoft JhengHei" w:hAnsi="Microsoft JhengHei"/>
+          <w:b/>
+          <w:color w:val="1B365D"/>
+        </w:rPr>
+        <w:t>5. HOW (量化驗收)：</w:t>
+      </w:r>
+      <w:r>
+        <w:rPr>
+          <w:rFonts w:ascii="Microsoft JhengHei" w:hAnsi="Microsoft JhengHei"/>
+          <w:color w:val="2D3748"/>
+          <w:sz w:val="21"/>
+        </w:rPr>
+        <w:t>提供可量化的客觀驗收指標（例如：100/100 測試通過）。這會觸發 Antigravity 的自動化測試與連環修復迴圈（Auto-Repair Loop），直到通過為止。</w:t>
+      </w:r>
+    </w:p>
+    <w:p>
+      <w:r>
+        <w:br w:type="page"/>
+      </w:r>
+    </w:p>
+    <w:p>
+      <w:pPr>
+        <w:keepNext/>
+        <w:spacing w:before="520" w:after="240"/>
+      </w:pPr>
+      <w:r>
+        <w:rPr>
+          <w:rFonts w:ascii="Microsoft JhengHei" w:hAnsi="Microsoft JhengHei"/>
+          <w:b/>
+          <w:color w:val="1B365D"/>
+          <w:sz w:val="34"/>
+        </w:rPr>
+        <w:t>第二章：專案環境準備與 Antigravity 工作區配置</w:t>
+      </w:r>
+    </w:p>
+    <w:p>
+      <w:pPr>
+        <w:keepNext/>
+        <w:spacing w:before="360" w:after="160"/>
+      </w:pPr>
+      <w:r>
+        <w:rPr>
+          <w:rFonts w:ascii="Microsoft JhengHei" w:hAnsi="Microsoft JhengHei"/>
+          <w:b/>
+          <w:color w:val="2C5282"/>
+          <w:sz w:val="27"/>
+        </w:rPr>
+        <w:t>2.1 環境安裝與工具盤點</w:t>
+      </w:r>
+    </w:p>
+    <w:p>
+      <w:pPr>
+        <w:spacing w:after="140" w:line="300" w:lineRule="auto"/>
+      </w:pPr>
+      <w:r>
+        <w:rPr>
+          <w:rFonts w:ascii="Microsoft JhengHei" w:hAnsi="Microsoft JhengHei"/>
+          <w:color w:val="2D3748"/>
+          <w:sz w:val="22"/>
+        </w:rPr>
+        <w:t>在開始打造 500 頁簡報與 Podcast 專案前，務必確認本機已安裝以下基礎工具鏈：</w:t>
+      </w:r>
+    </w:p>
+    <w:tbl>
+      <w:tblPr>
+        <w:tblW w:type="auto" w:w="0"/>
+        <w:jc w:val="center"/>
+        <w:tblLayout w:type="fixed"/>
+        <w:tblLook w:firstColumn="1" w:firstRow="1" w:lastColumn="0" w:lastRow="0" w:noHBand="0" w:noVBand="1" w:val="04A0"/>
+      </w:tblPr>
+      <w:tblGrid>
+        <w:gridCol w:w="3010"/>
+        <w:gridCol w:w="3010"/>
+        <w:gridCol w:w="3010"/>
+      </w:tblGrid>
+      <w:tr>
+        <w:tc>
+          <w:tcPr>
+            <w:tcW w:type="dxa" w:w="3010"/>
+            <w:shd w:fill="1B365D"/>
+            <w:tcMar>
+              <w:top w:w="120" w:type="dxa"/>
+              <w:bottom w:w="120" w:type="dxa"/>
+              <w:left w:w="140" w:type="dxa"/>
+              <w:right w:w="140" w:type="dxa"/>
+            </w:tcMar>
+          </w:tcPr>
+          <w:p>
+            <w:pPr>
+              <w:jc w:val="center"/>
+            </w:pPr>
+            <w:r>
+              <w:rPr>
+                <w:rFonts w:ascii="Microsoft JhengHei" w:hAnsi="Microsoft JhengHei"/>
+                <w:b/>
+                <w:color w:val="FFFFFF"/>
+                <w:sz w:val="20"/>
+              </w:rPr>
+              <w:t>工具名稱</w:t>
+            </w:r>
+          </w:p>
+        </w:tc>
+        <w:tc>
+          <w:tcPr>
+            <w:tcW w:type="dxa" w:w="3010"/>
+            <w:shd w:fill="1B365D"/>
+            <w:tcMar>
+              <w:top w:w="120" w:type="dxa"/>
+              <w:bottom w:w="120" w:type="dxa"/>
+              <w:left w:w="140" w:type="dxa"/>
+              <w:right w:w="140" w:type="dxa"/>
+            </w:tcMar>
+          </w:tcPr>
+          <w:p>
+            <w:pPr>
+              <w:jc w:val="center"/>
+            </w:pPr>
+            <w:r>
+              <w:rPr>
+                <w:rFonts w:ascii="Microsoft JhengHei" w:hAnsi="Microsoft JhengHei"/>
+                <w:b/>
+                <w:color w:val="FFFFFF"/>
+                <w:sz w:val="20"/>
+              </w:rPr>
+              <w:t>建議版本</w:t>
+            </w:r>
+          </w:p>
+        </w:tc>
+        <w:tc>
+          <w:tcPr>
+            <w:tcW w:type="dxa" w:w="3010"/>
+            <w:shd w:fill="1B365D"/>
+            <w:tcMar>
+              <w:top w:w="120" w:type="dxa"/>
+              <w:bottom w:w="120" w:type="dxa"/>
+              <w:left w:w="140" w:type="dxa"/>
+              <w:right w:w="140" w:type="dxa"/>
+            </w:tcMar>
+          </w:tcPr>
+          <w:p>
+            <w:pPr>
+              <w:jc w:val="center"/>
+            </w:pPr>
+            <w:r>
+              <w:rPr>
+                <w:rFonts w:ascii="Microsoft JhengHei" w:hAnsi="Microsoft JhengHei"/>
+                <w:b/>
+                <w:color w:val="FFFFFF"/>
+                <w:sz w:val="20"/>
+              </w:rPr>
+              <w:t>用途與說明</w:t>
+            </w:r>
+          </w:p>
+        </w:tc>
+      </w:tr>
+      <w:tr>
+        <w:tc>
+          <w:tcPr>
+            <w:tcW w:type="dxa" w:w="3010"/>
+            <w:shd w:fill="FFFFFF"/>
+            <w:tcMar>
+              <w:top w:w="100" w:type="dxa"/>
+              <w:bottom w:w="100" w:type="dxa"/>
+              <w:left w:w="140" w:type="dxa"/>
+              <w:right w:w="140" w:type="dxa"/>
+            </w:tcMar>
+          </w:tcPr>
+          <w:p>
+            <w:pPr>
+              <w:jc w:val="center"/>
+            </w:pPr>
+            <w:r>
+              <w:rPr>
+                <w:rFonts w:ascii="Microsoft JhengHei" w:hAnsi="Microsoft JhengHei"/>
+                <w:color w:val="2D3748"/>
+                <w:sz w:val="19"/>
+              </w:rPr>
+              <w:t>Node.js</w:t>
+            </w:r>
+          </w:p>
+        </w:tc>
+        <w:tc>
+          <w:tcPr>
+            <w:tcW w:type="dxa" w:w="3010"/>
+            <w:shd w:fill="FFFFFF"/>
+            <w:tcMar>
+              <w:top w:w="100" w:type="dxa"/>
+              <w:bottom w:w="100" w:type="dxa"/>
+              <w:left w:w="140" w:type="dxa"/>
+              <w:right w:w="140" w:type="dxa"/>
+            </w:tcMar>
+          </w:tcPr>
+          <w:p>
+            <w:r>
+              <w:rPr>
+                <w:rFonts w:ascii="Microsoft JhengHei" w:hAnsi="Microsoft JhengHei"/>
+                <w:color w:val="2D3748"/>
+                <w:sz w:val="19"/>
+              </w:rPr>
+              <w:t>v18.0.0+</w:t>
+            </w:r>
+          </w:p>
+        </w:tc>
+        <w:tc>
+          <w:tcPr>
+            <w:tcW w:type="dxa" w:w="3010"/>
+            <w:shd w:fill="FFFFFF"/>
+            <w:tcMar>
+              <w:top w:w="100" w:type="dxa"/>
+              <w:bottom w:w="100" w:type="dxa"/>
+              <w:left w:w="140" w:type="dxa"/>
+              <w:right w:w="140" w:type="dxa"/>
+            </w:tcMar>
+          </w:tcPr>
+          <w:p>
+            <w:r>
+              <w:rPr>
+                <w:rFonts w:ascii="Microsoft JhengHei" w:hAnsi="Microsoft JhengHei"/>
+                <w:color w:val="2D3748"/>
+                <w:sz w:val="19"/>
+              </w:rPr>
+              <w:t>用於執行 DOM 沙盒模擬測試、單一檔案 HTML 打包與網頁建置</w:t>
+            </w:r>
+          </w:p>
+        </w:tc>
+      </w:tr>
+      <w:tr>
+        <w:tc>
+          <w:tcPr>
+            <w:tcW w:type="dxa" w:w="3010"/>
+            <w:shd w:fill="F8FAFC"/>
+            <w:tcMar>
+              <w:top w:w="100" w:type="dxa"/>
+              <w:bottom w:w="100" w:type="dxa"/>
+              <w:left w:w="140" w:type="dxa"/>
+              <w:right w:w="140" w:type="dxa"/>
+            </w:tcMar>
+          </w:tcPr>
+          <w:p>
+            <w:pPr>
+              <w:jc w:val="center"/>
+            </w:pPr>
+            <w:r>
+              <w:rPr>
+                <w:rFonts w:ascii="Microsoft JhengHei" w:hAnsi="Microsoft JhengHei"/>
+                <w:color w:val="2D3748"/>
+                <w:sz w:val="19"/>
+              </w:rPr>
+              <w:t>Python</w:t>
+            </w:r>
+          </w:p>
+        </w:tc>
+        <w:tc>
+          <w:tcPr>
+            <w:tcW w:type="dxa" w:w="3010"/>
+            <w:shd w:fill="F8FAFC"/>
+            <w:tcMar>
+              <w:top w:w="100" w:type="dxa"/>
+              <w:bottom w:w="100" w:type="dxa"/>
+              <w:left w:w="140" w:type="dxa"/>
+              <w:right w:w="140" w:type="dxa"/>
+            </w:tcMar>
+          </w:tcPr>
+          <w:p>
+            <w:r>
+              <w:rPr>
+                <w:rFonts w:ascii="Microsoft JhengHei" w:hAnsi="Microsoft JhengHei"/>
+                <w:color w:val="2D3748"/>
+                <w:sz w:val="19"/>
+              </w:rPr>
+              <w:t>3.10+</w:t>
+            </w:r>
+          </w:p>
+        </w:tc>
+        <w:tc>
+          <w:tcPr>
+            <w:tcW w:type="dxa" w:w="3010"/>
+            <w:shd w:fill="F8FAFC"/>
+            <w:tcMar>
+              <w:top w:w="100" w:type="dxa"/>
+              <w:bottom w:w="100" w:type="dxa"/>
+              <w:left w:w="140" w:type="dxa"/>
+              <w:right w:w="140" w:type="dxa"/>
+            </w:tcMar>
+          </w:tcPr>
+          <w:p>
+            <w:r>
+              <w:rPr>
+                <w:rFonts w:ascii="Microsoft JhengHei" w:hAnsi="Microsoft JhengHei"/>
+                <w:color w:val="2D3748"/>
+                <w:sz w:val="19"/>
+              </w:rPr>
+              <w:t>用於執行 edge-tts 語音合成、python-docx Word 生成與 Matplotlib 製圖</w:t>
+            </w:r>
+          </w:p>
+        </w:tc>
+      </w:tr>
+      <w:tr>
+        <w:tc>
+          <w:tcPr>
+            <w:tcW w:type="dxa" w:w="3010"/>
+            <w:shd w:fill="FFFFFF"/>
+            <w:tcMar>
+              <w:top w:w="100" w:type="dxa"/>
+              <w:bottom w:w="100" w:type="dxa"/>
+              <w:left w:w="140" w:type="dxa"/>
+              <w:right w:w="140" w:type="dxa"/>
+            </w:tcMar>
+          </w:tcPr>
+          <w:p>
+            <w:pPr>
+              <w:jc w:val="center"/>
+            </w:pPr>
+            <w:r>
+              <w:rPr>
+                <w:rFonts w:ascii="Microsoft JhengHei" w:hAnsi="Microsoft JhengHei"/>
+                <w:color w:val="2D3748"/>
+                <w:sz w:val="19"/>
+              </w:rPr>
+              <w:t>edge-tts</w:t>
+            </w:r>
+          </w:p>
+        </w:tc>
+        <w:tc>
+          <w:tcPr>
+            <w:tcW w:type="dxa" w:w="3010"/>
+            <w:shd w:fill="FFFFFF"/>
+            <w:tcMar>
+              <w:top w:w="100" w:type="dxa"/>
+              <w:bottom w:w="100" w:type="dxa"/>
+              <w:left w:w="140" w:type="dxa"/>
+              <w:right w:w="140" w:type="dxa"/>
+            </w:tcMar>
+          </w:tcPr>
+          <w:p>
+            <w:r>
+              <w:rPr>
+                <w:rFonts w:ascii="Microsoft JhengHei" w:hAnsi="Microsoft JhengHei"/>
+                <w:color w:val="2D3748"/>
+                <w:sz w:val="19"/>
+              </w:rPr>
+              <w:t>v7.2.0+</w:t>
+            </w:r>
+          </w:p>
+        </w:tc>
+        <w:tc>
+          <w:tcPr>
+            <w:tcW w:type="dxa" w:w="3010"/>
+            <w:shd w:fill="FFFFFF"/>
+            <w:tcMar>
+              <w:top w:w="100" w:type="dxa"/>
+              <w:bottom w:w="100" w:type="dxa"/>
+              <w:left w:w="140" w:type="dxa"/>
+              <w:right w:w="140" w:type="dxa"/>
+            </w:tcMar>
+          </w:tcPr>
+          <w:p>
+            <w:r>
+              <w:rPr>
+                <w:rFonts w:ascii="Microsoft JhengHei" w:hAnsi="Microsoft JhengHei"/>
+                <w:color w:val="2D3748"/>
+                <w:sz w:val="19"/>
+              </w:rPr>
+              <w:t>Python 開源套件，直接對接 Microsoft Azure Neural 廣播級神經語音引擎</w:t>
+            </w:r>
+          </w:p>
+        </w:tc>
+      </w:tr>
+      <w:tr>
+        <w:tc>
+          <w:tcPr>
+            <w:tcW w:type="dxa" w:w="3010"/>
+            <w:shd w:fill="F8FAFC"/>
+            <w:tcMar>
+              <w:top w:w="100" w:type="dxa"/>
+              <w:bottom w:w="100" w:type="dxa"/>
+              <w:left w:w="140" w:type="dxa"/>
+              <w:right w:w="140" w:type="dxa"/>
+            </w:tcMar>
+          </w:tcPr>
+          <w:p>
+            <w:pPr>
+              <w:jc w:val="center"/>
+            </w:pPr>
+            <w:r>
+              <w:rPr>
+                <w:rFonts w:ascii="Microsoft JhengHei" w:hAnsi="Microsoft JhengHei"/>
+                <w:color w:val="2D3748"/>
+                <w:sz w:val="19"/>
+              </w:rPr>
+              <w:t>Git</w:t>
+            </w:r>
+          </w:p>
+        </w:tc>
+        <w:tc>
+          <w:tcPr>
+            <w:tcW w:type="dxa" w:w="3010"/>
+            <w:shd w:fill="F8FAFC"/>
+            <w:tcMar>
+              <w:top w:w="100" w:type="dxa"/>
+              <w:bottom w:w="100" w:type="dxa"/>
+              <w:left w:w="140" w:type="dxa"/>
+              <w:right w:w="140" w:type="dxa"/>
+            </w:tcMar>
+          </w:tcPr>
+          <w:p>
+            <w:r>
+              <w:rPr>
+                <w:rFonts w:ascii="Microsoft JhengHei" w:hAnsi="Microsoft JhengHei"/>
+                <w:color w:val="2D3748"/>
+                <w:sz w:val="19"/>
+              </w:rPr>
+              <w:t>v2.30.0+</w:t>
+            </w:r>
+          </w:p>
+        </w:tc>
+        <w:tc>
+          <w:tcPr>
+            <w:tcW w:type="dxa" w:w="3010"/>
+            <w:shd w:fill="F8FAFC"/>
+            <w:tcMar>
+              <w:top w:w="100" w:type="dxa"/>
+              <w:bottom w:w="100" w:type="dxa"/>
+              <w:left w:w="140" w:type="dxa"/>
+              <w:right w:w="140" w:type="dxa"/>
+            </w:tcMar>
+          </w:tcPr>
+          <w:p>
+            <w:r>
+              <w:rPr>
+                <w:rFonts w:ascii="Microsoft JhengHei" w:hAnsi="Microsoft JhengHei"/>
+                <w:color w:val="2D3748"/>
+                <w:sz w:val="19"/>
+              </w:rPr>
+              <w:t>版本控制工具，管理檔案變更與 GitHub Pages 免費雲端託管部署</w:t>
+            </w:r>
+          </w:p>
+        </w:tc>
+      </w:tr>
+      <w:tr>
+        <w:tc>
+          <w:tcPr>
+            <w:tcW w:type="dxa" w:w="3010"/>
+            <w:shd w:fill="FFFFFF"/>
+            <w:tcMar>
+              <w:top w:w="100" w:type="dxa"/>
+              <w:bottom w:w="100" w:type="dxa"/>
+              <w:left w:w="140" w:type="dxa"/>
+              <w:right w:w="140" w:type="dxa"/>
+            </w:tcMar>
+          </w:tcPr>
+          <w:p>
+            <w:pPr>
+              <w:jc w:val="center"/>
+            </w:pPr>
+            <w:r>
+              <w:rPr>
+                <w:rFonts w:ascii="Microsoft JhengHei" w:hAnsi="Microsoft JhengHei"/>
+                <w:color w:val="2D3748"/>
+                <w:sz w:val="19"/>
+              </w:rPr>
+              <w:t>VS Code</w:t>
+            </w:r>
+          </w:p>
+        </w:tc>
+        <w:tc>
+          <w:tcPr>
+            <w:tcW w:type="dxa" w:w="3010"/>
+            <w:shd w:fill="FFFFFF"/>
+            <w:tcMar>
+              <w:top w:w="100" w:type="dxa"/>
+              <w:bottom w:w="100" w:type="dxa"/>
+              <w:left w:w="140" w:type="dxa"/>
+              <w:right w:w="140" w:type="dxa"/>
+            </w:tcMar>
+          </w:tcPr>
+          <w:p>
+            <w:r>
+              <w:rPr>
+                <w:rFonts w:ascii="Microsoft JhengHei" w:hAnsi="Microsoft JhengHei"/>
+                <w:color w:val="2D3748"/>
+                <w:sz w:val="19"/>
+              </w:rPr>
+              <w:t>最新版</w:t>
+            </w:r>
+          </w:p>
+        </w:tc>
+        <w:tc>
+          <w:tcPr>
+            <w:tcW w:type="dxa" w:w="3010"/>
+            <w:shd w:fill="FFFFFF"/>
+            <w:tcMar>
+              <w:top w:w="100" w:type="dxa"/>
+              <w:bottom w:w="100" w:type="dxa"/>
+              <w:left w:w="140" w:type="dxa"/>
+              <w:right w:w="140" w:type="dxa"/>
+            </w:tcMar>
+          </w:tcPr>
+          <w:p>
+            <w:r>
+              <w:rPr>
+                <w:rFonts w:ascii="Microsoft JhengHei" w:hAnsi="Microsoft JhengHei"/>
+                <w:color w:val="2D3748"/>
+                <w:sz w:val="19"/>
+              </w:rPr>
+              <w:t>文字編輯器，用於檢視 HTML/JS/CSS 原始碼與 Markdown 講義</w:t>
+            </w:r>
+          </w:p>
+        </w:tc>
+      </w:tr>
+    </w:tbl>
+    <w:p>
+      <w:pPr>
+        <w:spacing w:before="120" w:after="120"/>
+      </w:pPr>
+    </w:p>
+    <w:p>
+      <w:pPr>
+        <w:keepNext/>
+        <w:spacing w:before="360" w:after="160"/>
+      </w:pPr>
+      <w:r>
+        <w:rPr>
+          <w:rFonts w:ascii="Microsoft JhengHei" w:hAnsi="Microsoft JhengHei"/>
+          <w:b/>
+          <w:color w:val="2C5282"/>
+          <w:sz w:val="27"/>
+        </w:rPr>
+        <w:t>2.2 Antigravity 專案目錄結構設計</w:t>
+      </w:r>
+    </w:p>
+    <w:tbl>
+      <w:tblPr>
+        <w:tblW w:type="auto" w:w="0"/>
+        <w:jc w:val="center"/>
+        <w:tblLayout w:type="fixed"/>
+        <w:tblLook w:firstColumn="1" w:firstRow="1" w:lastColumn="0" w:lastRow="0" w:noHBand="0" w:noVBand="1" w:val="04A0"/>
+      </w:tblPr>
+      <w:tblGrid>
+        <w:gridCol w:w="9029"/>
+      </w:tblGrid>
+      <w:tr>
+        <w:tc>
+          <w:tcPr>
+            <w:tcW w:type="dxa" w:w="9029"/>
+            <w:tcMar>
+              <w:top w:w="100" w:type="dxa"/>
+              <w:bottom w:w="100" w:type="dxa"/>
+              <w:left w:w="180" w:type="dxa"/>
+              <w:right w:w="180" w:type="dxa"/>
+            </w:tcMar>
+            <w:shd w:fill="1E293B"/>
+            <w:tcBorders>
+              <w:top w:val="single" w:sz="6" w:space="0" w:color="334155"/>
+              <w:left w:val="single" w:sz="6" w:space="0" w:color="334155"/>
+              <w:bottom w:val="single" w:sz="6" w:space="0" w:color="334155"/>
+              <w:right w:val="single" w:sz="6" w:space="0" w:color="334155"/>
+            </w:tcBorders>
+          </w:tcPr>
+          <w:p>
+            <w:pPr>
+              <w:spacing w:after="40"/>
+            </w:pPr>
+            <w:r>
+              <w:rPr>
+                <w:rFonts w:ascii="Consolas" w:hAnsi="Consolas"/>
+                <w:color w:val="E2E8F0"/>
+                <w:sz w:val="19"/>
+              </w:rPr>
+              <w:t>c:/Users/DELL/Desktop/新增資料夾 (8)/</w:t>
+              <w:br/>
+              <w:t>├── index.html                           # 500 頁單一檔案互動簡報 (1.35 MB)</w:t>
+              <w:br/>
+              <w:t>├── podcast_player.html                  # 30 分鐘特企雙主持 Podcast 播放器</w:t>
+              <w:br/>
+              <w:t>├── podcast_audio_30min.mp3              # 30 分鐘雙主持廣播實體 MP3 音訊 (9.18 MB)</w:t>
+              <w:br/>
+              <w:t>├── 行政法500頁旗艦講義_1000字講稿全集.docx  # 50 萬字大書講稿 Word 文件</w:t>
+              <w:br/>
+              <w:t>├── css/</w:t>
+              <w:br/>
+              <w:t>│   └── style.css                        # 深色極光 CSS 視覺設計系統</w:t>
+              <w:br/>
+              <w:t>├── js/</w:t>
+              <w:br/>
+              <w:t>│   ├── slidesData.js                    # 500 頁簡報資料定義檔</w:t>
+              <w:br/>
+              <w:t>│   └── app.js                           # 簡報互動邏輯與 Web Speech 播放引擎</w:t>
+              <w:br/>
+              <w:t>└── scratch/                             # Antigravity 實驗與自動化測試腳本區</w:t>
+              <w:br/>
+              <w:t xml:space="preserve">    ├── build_single_file.js             # 簡報單一檔案打包腳本</w:t>
+              <w:br/>
+              <w:t xml:space="preserve">    ├── synthesize_dual_host_audio.py    # 雙主持人語音合成腳本</w:t>
+              <w:br/>
+              <w:t xml:space="preserve">    ├── update_player_html.py            # 播放器時間軸同步更新腳本</w:t>
+              <w:br/>
+              <w:t xml:space="preserve">    ├── audit_50_dual_host_podcast.js    # 50 輪播放器點擊測試腳本</w:t>
+              <w:br/>
+              <w:t xml:space="preserve">    └── verify_100_rounds_podcast_legal.py # 100 輪臺灣法律稽核腳本</w:t>
+            </w:r>
+          </w:p>
+        </w:tc>
+      </w:tr>
+    </w:tbl>
+    <w:p>
+      <w:pPr>
+        <w:spacing w:before="80" w:after="80"/>
+      </w:pPr>
+    </w:p>
+    <w:p>
+      <w:r>
+        <w:br w:type="page"/>
+      </w:r>
+    </w:p>
+    <w:p>
+      <w:pPr>
+        <w:keepNext/>
+        <w:spacing w:before="520" w:after="240"/>
+      </w:pPr>
+      <w:r>
+        <w:rPr>
+          <w:rFonts w:ascii="Microsoft JhengHei" w:hAnsi="Microsoft JhengHei"/>
+          <w:b/>
+          <w:color w:val="1B365D"/>
+          <w:sz w:val="34"/>
+        </w:rPr>
+        <w:t>第三章：500 頁 HTML 互動簡報系統架構與實戰 Prompt 範例</w:t>
+      </w:r>
+    </w:p>
+    <w:p>
+      <w:pPr>
+        <w:keepNext/>
+        <w:spacing w:before="360" w:after="160"/>
+      </w:pPr>
+      <w:r>
+        <w:rPr>
+          <w:rFonts w:ascii="Microsoft JhengHei" w:hAnsi="Microsoft JhengHei"/>
+          <w:b/>
+          <w:color w:val="2C5282"/>
+          <w:sz w:val="27"/>
+        </w:rPr>
+        <w:t>3.1 行政法 HTML 簡報專案實戰 Prompt 模板 1</w:t>
+      </w:r>
+    </w:p>
+    <w:p>
+      <w:pPr>
+        <w:spacing w:after="140" w:line="300" w:lineRule="auto"/>
+      </w:pPr>
+      <w:r>
+        <w:rPr>
+          <w:rFonts w:ascii="Microsoft JhengHei" w:hAnsi="Microsoft JhengHei"/>
+          <w:color w:val="2D3748"/>
+          <w:sz w:val="22"/>
+        </w:rPr>
+        <w:t>在行政法簡報開發階段，我們需要引導 AI 建立兼具視覺美感與互動功能的 500 頁單一 HTML 檔案。以下為可直接複製使用之完整 Prompt 指令：</w:t>
       </w:r>
     </w:p>
     <w:tbl>
@@ -719,7 +1498,7 @@
                 <w:color w:val="1B365D"/>
                 <w:sz w:val="22"/>
               </w:rPr>
-              <w:t>[Antigravity 完整提示詞指令模板 (Prompt Template)]  4W1H 提示詞黃金公式 (Prompt Golden Rule)</w:t>
+              <w:t>[行政法專案實戰 Prompt 指令範例模板]  【行政法 HTML 簡報開發實戰 Prompt 範例模板】</w:t>
               <w:br/>
             </w:r>
             <w:r>
@@ -728,15 +1507,23 @@
                 <w:color w:val="2D3748"/>
                 <w:sz w:val="20"/>
               </w:rPr>
-              <w:t>【Who】角色定位：指定 AI 的身份（例如：請扮演資深 Web 開發者與廣播製作人）</w:t>
+              <w:t>請扮演資深 Web 前端架構師與 108 課綱公民與社會科教學專家。</w:t>
               <w:br/>
-              <w:t>【What】目標成果：明確產出物名稱與格式（例如：製作 500 頁 HTML 簡報與 30 分鐘 Podcast MP3）</w:t>
+              <w:t>【目標】：請為我建立一個包含 500 頁簡報的單一檔案 HTML 互動簡報系統（儲存於專案根目錄 index.html）。</w:t>
               <w:br/>
-              <w:t>【Where】儲存路徑：指定檔案存放目錄（例如：儲存於專案根目錄 index.html）</w:t>
+              <w:t>【技術規範與細節】：</w:t>
               <w:br/>
-              <w:t>【Why】業務背景：說明使用情境與對象（例如：高中公民行政法複習，需符合 108 課綱與臺灣法律）</w:t>
+              <w:t>1. UI 設計：採用現代「深色極光 (Dark Aurora)」主視覺風格，使用 HSL 調和配色、漸層發光背景與微互動動畫。</w:t>
               <w:br/>
-              <w:t>【How】驗收標準：量化指標（例如：進行 100 次自動化測試驗證，確保 100% 無錯誤）</w:t>
+              <w:t>2. 資料架構：採用資料與 UI 分離架構，在 js/slidesData.js 定義 500 頁結構化簡報資料。</w:t>
+              <w:br/>
+              <w:t>3. 互動題型：內建選擇題、配合題、填空題、是非題與簡答題 5 大素養題型組件，點擊時即時反饋答案與詳細解析。</w:t>
+              <w:br/>
+              <w:t>4. 新聞案例容器：針對 80+ 頁新聞案例頁（如高鐵採購、酒駕裁罰、路面坑洞），建立【事件脈絡】、【法律爭點】與【大考考點】3 卡視覺容器。</w:t>
+              <w:br/>
+              <w:t>5. 打包腳本：撰寫 Node.js 腳本 scratch/build_single_file.js，將 CSS、JS 與資料完全內嵌至 index.html (約 1.35 MB)。</w:t>
+              <w:br/>
+              <w:t>【驗收標準】：開啟 index.html 時載入順暢，所有 500 頁簡報跳轉與互動題型均可正常點擊與顯示。</w:t>
             </w:r>
           </w:p>
         </w:tc>
@@ -745,6 +1532,258 @@
     <w:p>
       <w:pPr>
         <w:spacing w:before="80" w:after="80"/>
+      </w:pPr>
+    </w:p>
+    <w:p>
+      <w:pPr>
+        <w:keepNext/>
+        <w:spacing w:before="360" w:after="160"/>
+      </w:pPr>
+      <w:r>
+        <w:rPr>
+          <w:rFonts w:ascii="Microsoft JhengHei" w:hAnsi="Microsoft JhengHei"/>
+          <w:b/>
+          <w:color w:val="2C5282"/>
+          <w:sz w:val="27"/>
+        </w:rPr>
+        <w:t>3.2 Prompt 實戰解說與輸入/輸出比對</w:t>
+      </w:r>
+    </w:p>
+    <w:p>
+      <w:pPr>
+        <w:spacing w:after="140" w:line="300" w:lineRule="auto"/>
+      </w:pPr>
+      <w:r>
+        <w:rPr>
+          <w:rFonts w:ascii="Microsoft JhengHei" w:hAnsi="Microsoft JhengHei"/>
+          <w:color w:val="2D3748"/>
+          <w:sz w:val="22"/>
+        </w:rPr>
+        <w:t>以下針對上述 Prompt 模板 1 的『使用者輸入』、AI 的『內部執行軌跡』與『實體產出成果』進行比對說明：</w:t>
+      </w:r>
+    </w:p>
+    <w:tbl>
+      <w:tblPr>
+        <w:tblW w:type="auto" w:w="0"/>
+        <w:jc w:val="center"/>
+        <w:tblLayout w:type="fixed"/>
+        <w:tblLook w:firstColumn="1" w:firstRow="1" w:lastColumn="0" w:lastRow="0" w:noHBand="0" w:noVBand="1" w:val="04A0"/>
+      </w:tblPr>
+      <w:tblGrid>
+        <w:gridCol w:w="4514"/>
+        <w:gridCol w:w="4514"/>
+      </w:tblGrid>
+      <w:tr>
+        <w:tc>
+          <w:tcPr>
+            <w:tcW w:type="dxa" w:w="4514"/>
+            <w:shd w:fill="1B365D"/>
+            <w:tcMar>
+              <w:top w:w="120" w:type="dxa"/>
+              <w:bottom w:w="120" w:type="dxa"/>
+              <w:left w:w="140" w:type="dxa"/>
+              <w:right w:w="140" w:type="dxa"/>
+            </w:tcMar>
+          </w:tcPr>
+          <w:p>
+            <w:pPr>
+              <w:jc w:val="center"/>
+            </w:pPr>
+            <w:r>
+              <w:rPr>
+                <w:rFonts w:ascii="Microsoft JhengHei" w:hAnsi="Microsoft JhengHei"/>
+                <w:b/>
+                <w:color w:val="FFFFFF"/>
+                <w:sz w:val="20"/>
+              </w:rPr>
+              <w:t>階段比對項目</w:t>
+            </w:r>
+          </w:p>
+        </w:tc>
+        <w:tc>
+          <w:tcPr>
+            <w:tcW w:type="dxa" w:w="4514"/>
+            <w:shd w:fill="1B365D"/>
+            <w:tcMar>
+              <w:top w:w="120" w:type="dxa"/>
+              <w:bottom w:w="120" w:type="dxa"/>
+              <w:left w:w="140" w:type="dxa"/>
+              <w:right w:w="140" w:type="dxa"/>
+            </w:tcMar>
+          </w:tcPr>
+          <w:p>
+            <w:pPr>
+              <w:jc w:val="center"/>
+            </w:pPr>
+            <w:r>
+              <w:rPr>
+                <w:rFonts w:ascii="Microsoft JhengHei" w:hAnsi="Microsoft JhengHei"/>
+                <w:b/>
+                <w:color w:val="FFFFFF"/>
+                <w:sz w:val="20"/>
+              </w:rPr>
+              <w:t>Antigravity AI 運算軌跡與實體產出細節說明</w:t>
+            </w:r>
+          </w:p>
+        </w:tc>
+      </w:tr>
+      <w:tr>
+        <w:tc>
+          <w:tcPr>
+            <w:tcW w:type="dxa" w:w="4514"/>
+            <w:shd w:fill="FFFFFF"/>
+            <w:tcMar>
+              <w:top w:w="100" w:type="dxa"/>
+              <w:bottom w:w="100" w:type="dxa"/>
+              <w:left w:w="140" w:type="dxa"/>
+              <w:right w:w="140" w:type="dxa"/>
+            </w:tcMar>
+          </w:tcPr>
+          <w:p>
+            <w:pPr>
+              <w:jc w:val="center"/>
+            </w:pPr>
+            <w:r>
+              <w:rPr>
+                <w:rFonts w:ascii="Microsoft JhengHei" w:hAnsi="Microsoft JhengHei"/>
+                <w:color w:val="2D3748"/>
+                <w:sz w:val="19"/>
+              </w:rPr>
+              <w:t>📥 使用者輸入 Prompt</w:t>
+            </w:r>
+          </w:p>
+        </w:tc>
+        <w:tc>
+          <w:tcPr>
+            <w:tcW w:type="dxa" w:w="4514"/>
+            <w:shd w:fill="FFFFFF"/>
+            <w:tcMar>
+              <w:top w:w="100" w:type="dxa"/>
+              <w:bottom w:w="100" w:type="dxa"/>
+              <w:left w:w="140" w:type="dxa"/>
+              <w:right w:w="140" w:type="dxa"/>
+            </w:tcMar>
+          </w:tcPr>
+          <w:p>
+            <w:r>
+              <w:rPr>
+                <w:rFonts w:ascii="Microsoft JhengHei" w:hAnsi="Microsoft JhengHei"/>
+                <w:color w:val="2D3748"/>
+                <w:sz w:val="19"/>
+              </w:rPr>
+              <w:t>指定『Web 前端架構師』+『500 頁 HTML』+『深色極光 UI』+『3 卡新聞容器』+『build_single_file.js 打包』</w:t>
+            </w:r>
+          </w:p>
+        </w:tc>
+      </w:tr>
+      <w:tr>
+        <w:tc>
+          <w:tcPr>
+            <w:tcW w:type="dxa" w:w="4514"/>
+            <w:shd w:fill="F8FAFC"/>
+            <w:tcMar>
+              <w:top w:w="100" w:type="dxa"/>
+              <w:bottom w:w="100" w:type="dxa"/>
+              <w:left w:w="140" w:type="dxa"/>
+              <w:right w:w="140" w:type="dxa"/>
+            </w:tcMar>
+          </w:tcPr>
+          <w:p>
+            <w:pPr>
+              <w:jc w:val="center"/>
+            </w:pPr>
+            <w:r>
+              <w:rPr>
+                <w:rFonts w:ascii="Microsoft JhengHei" w:hAnsi="Microsoft JhengHei"/>
+                <w:color w:val="2D3748"/>
+                <w:sz w:val="19"/>
+              </w:rPr>
+              <w:t>⚙️ AI 執行軌跡 (Trajectory)</w:t>
+            </w:r>
+          </w:p>
+        </w:tc>
+        <w:tc>
+          <w:tcPr>
+            <w:tcW w:type="dxa" w:w="4514"/>
+            <w:shd w:fill="F8FAFC"/>
+            <w:tcMar>
+              <w:top w:w="100" w:type="dxa"/>
+              <w:bottom w:w="100" w:type="dxa"/>
+              <w:left w:w="140" w:type="dxa"/>
+              <w:right w:w="140" w:type="dxa"/>
+            </w:tcMar>
+          </w:tcPr>
+          <w:p>
+            <w:r>
+              <w:rPr>
+                <w:rFonts w:ascii="Microsoft JhengHei" w:hAnsi="Microsoft JhengHei"/>
+                <w:color w:val="2D3748"/>
+                <w:sz w:val="19"/>
+              </w:rPr>
+              <w:t>1. 建立 js/slidesData.js 寫入 500 頁結構化 JSON。</w:t>
+              <w:br/>
+              <w:t>2. 撰寫 css/style.css 定義 HSL 深色發光樣式。</w:t>
+              <w:br/>
+              <w:t>3. 在 js/app.js 撰寫 5 大題型互動邏輯。</w:t>
+              <w:br/>
+              <w:t>4. 執行 node scratch/build_single_file.js 打包單檔。</w:t>
+            </w:r>
+          </w:p>
+        </w:tc>
+      </w:tr>
+      <w:tr>
+        <w:tc>
+          <w:tcPr>
+            <w:tcW w:type="dxa" w:w="4514"/>
+            <w:shd w:fill="FFFFFF"/>
+            <w:tcMar>
+              <w:top w:w="100" w:type="dxa"/>
+              <w:bottom w:w="100" w:type="dxa"/>
+              <w:left w:w="140" w:type="dxa"/>
+              <w:right w:w="140" w:type="dxa"/>
+            </w:tcMar>
+          </w:tcPr>
+          <w:p>
+            <w:pPr>
+              <w:jc w:val="center"/>
+            </w:pPr>
+            <w:r>
+              <w:rPr>
+                <w:rFonts w:ascii="Microsoft JhengHei" w:hAnsi="Microsoft JhengHei"/>
+                <w:color w:val="2D3748"/>
+                <w:sz w:val="19"/>
+              </w:rPr>
+              <w:t>📤 實體產出成果 (Output)</w:t>
+            </w:r>
+          </w:p>
+        </w:tc>
+        <w:tc>
+          <w:tcPr>
+            <w:tcW w:type="dxa" w:w="4514"/>
+            <w:shd w:fill="FFFFFF"/>
+            <w:tcMar>
+              <w:top w:w="100" w:type="dxa"/>
+              <w:bottom w:w="100" w:type="dxa"/>
+              <w:left w:w="140" w:type="dxa"/>
+              <w:right w:w="140" w:type="dxa"/>
+            </w:tcMar>
+          </w:tcPr>
+          <w:p>
+            <w:r>
+              <w:rPr>
+                <w:rFonts w:ascii="Microsoft JhengHei" w:hAnsi="Microsoft JhengHei"/>
+                <w:color w:val="2D3748"/>
+                <w:sz w:val="19"/>
+              </w:rPr>
+              <w:t>產出單一 HTML 檔案 c:/Users/DELL/Desktop/新增資料夾 (8)/index.html (大小約 1.35 MB)，雙擊即可直接在瀏覽器開啟播放！</w:t>
+            </w:r>
+          </w:p>
+        </w:tc>
+      </w:tr>
+    </w:tbl>
+    <w:p>
+      <w:pPr>
+        <w:spacing w:before="120" w:after="120"/>
       </w:pPr>
     </w:p>
     <w:p>
@@ -764,7 +1803,7 @@
           <w:color w:val="1B365D"/>
           <w:sz w:val="34"/>
         </w:rPr>
-        <w:t>第三章：500 頁 HTML 互動簡報系統架構與開發實戰</w:t>
+        <w:t>第四章：50 萬字大書講稿與 Word 全集自動化生成實戰 Prompt 範例</w:t>
       </w:r>
     </w:p>
     <w:p>
@@ -779,7 +1818,7 @@
           <w:color w:val="2C5282"/>
           <w:sz w:val="27"/>
         </w:rPr>
-        <w:t>3.1 簡報設計理念與單一檔案 HTML 打包技術</w:t>
+        <w:t>4.1 行政法 Word 講稿專案實戰 Prompt 模板 2</w:t>
       </w:r>
     </w:p>
     <w:p>
@@ -792,7 +1831,7 @@
           <w:color w:val="2D3748"/>
           <w:sz w:val="22"/>
         </w:rPr>
-        <w:t>採用「深色極光 (Dark Aurora)」主視覺，使用 HSL 調和配色、漸層發光背景與 5 大題型互動組件。透過 Node.js 腳本 scratch/build_single_file.js 打包至單一 index.html (1.35 MB)。</w:t>
+        <w:t>每一頁簡報搭配 1,000 字精華講稿與法理延伸，透過 Python python-docx 套件自動生成企業級 Word 文件 (`行政法500頁旗艦講義_1000字講稿全集.docx`)。</w:t>
       </w:r>
     </w:p>
     <w:tbl>
@@ -834,7 +1873,7 @@
                 <w:color w:val="1B365D"/>
                 <w:sz w:val="22"/>
               </w:rPr>
-              <w:t>[Antigravity 完整提示詞指令模板 (Prompt Template)]  Prompt 模板 1：500 頁 HTML 互動簡報開發完整指令</w:t>
+              <w:t>[行政法專案實戰 Prompt 指令範例模板]  【行政法 50 萬字 Word 講稿全集自動化生成 Prompt 範例模板】</w:t>
               <w:br/>
             </w:r>
             <w:r>
@@ -843,23 +1882,17 @@
                 <w:color w:val="2D3748"/>
                 <w:sz w:val="20"/>
               </w:rPr>
-              <w:t>請扮演資深 Web 前端架構師與 108 課綱公民與社會科教學專家。</w:t>
+              <w:t>請扮演資深行政法法學教授與 Python 文件自動化開發工程師。</w:t>
               <w:br/>
-              <w:t>【目標】：請為我建立一個包含 500 頁簡報的單一檔案 HTML 互動簡報系統（儲存於專案根目錄 index.html）。</w:t>
+              <w:t>【目標】：請為 500 頁簡報中的每一頁撰寫 1,000 字的精華延伸講稿（全集共計 500,000 字），並透過 Python python-docx 套件自動生成企業級 Word 文件（行政法500頁旗艦講義_1000字講稿全集.docx）。</w:t>
               <w:br/>
-              <w:t>【技術規範與細節】：</w:t>
+              <w:t>【要求】：</w:t>
               <w:br/>
-              <w:t>1. UI 設計：採用現代「深色極光 (Dark Aurora)」主視覺風格，使用 HSL 調和配色、漸層發光背景與微互動動畫。</w:t>
+              <w:t>1. 內容規範：講稿需完整涵蓋《行政程序法》、《行政罰法》、《行政執行法》、《訴願法》、《行政訴訟法》與《國家賠償法》，並融入大法官憲判字與最新考題陷阱說明。</w:t>
               <w:br/>
-              <w:t>2. 資料架構：採用資料與 UI 分離架構，在 js/slidesData.js 定義 500 頁結構化簡報資料。</w:t>
+              <w:t>2. 排版樣式：採用深海藍 (#1B365D) 主標題、微軟正黑體 11pt 內文、1.25 倍行高、內嵌法理比較表格與 Matplotlib 統計圖表。</w:t>
               <w:br/>
-              <w:t>3. 互動題型：內建選擇題、配合題、填空題、是非題與簡答題 5 大素養題型組件，點擊時即時反饋答案與詳細解析。</w:t>
-              <w:br/>
-              <w:t>4. 新聞案例容器：針對 80+ 頁新聞案例頁，建立【事件脈絡】、【法律爭點】與【大考考點】3 卡視覺容器。</w:t>
-              <w:br/>
-              <w:t>5. 打包腳本：撰寫 Node.js 腳本 scratch/build_single_file.js，將 CSS、JS 與資料完全內嵌至 index.html (約 1.35 MB)。</w:t>
-              <w:br/>
-              <w:t>【驗收標準】：開啟 index.html 時載入順暢，所有 500 頁簡報跳轉與互動題型均可正常點擊與顯示。</w:t>
+              <w:t>3. 自動化稽核：撰寫 Python 腳本 scratch/verify_100_rounds_docx_taiwan_law.py，對產出的 Word 講稿進行 100 輪臺灣法律條號與專有名詞正確性驗證，確保 100/100 通過！</w:t>
             </w:r>
           </w:p>
         </w:tc>
@@ -868,6 +1901,245 @@
     <w:p>
       <w:pPr>
         <w:spacing w:before="80" w:after="80"/>
+      </w:pPr>
+    </w:p>
+    <w:p>
+      <w:pPr>
+        <w:keepNext/>
+        <w:spacing w:before="360" w:after="160"/>
+      </w:pPr>
+      <w:r>
+        <w:rPr>
+          <w:rFonts w:ascii="Microsoft JhengHei" w:hAnsi="Microsoft JhengHei"/>
+          <w:b/>
+          <w:color w:val="2C5282"/>
+          <w:sz w:val="27"/>
+        </w:rPr>
+        <w:t>4.2 Prompt 實戰解說與輸入/輸出比對</w:t>
+      </w:r>
+    </w:p>
+    <w:tbl>
+      <w:tblPr>
+        <w:tblW w:type="auto" w:w="0"/>
+        <w:jc w:val="center"/>
+        <w:tblLayout w:type="fixed"/>
+        <w:tblLook w:firstColumn="1" w:firstRow="1" w:lastColumn="0" w:lastRow="0" w:noHBand="0" w:noVBand="1" w:val="04A0"/>
+      </w:tblPr>
+      <w:tblGrid>
+        <w:gridCol w:w="4514"/>
+        <w:gridCol w:w="4514"/>
+      </w:tblGrid>
+      <w:tr>
+        <w:tc>
+          <w:tcPr>
+            <w:tcW w:type="dxa" w:w="4514"/>
+            <w:shd w:fill="1B365D"/>
+            <w:tcMar>
+              <w:top w:w="120" w:type="dxa"/>
+              <w:bottom w:w="120" w:type="dxa"/>
+              <w:left w:w="140" w:type="dxa"/>
+              <w:right w:w="140" w:type="dxa"/>
+            </w:tcMar>
+          </w:tcPr>
+          <w:p>
+            <w:pPr>
+              <w:jc w:val="center"/>
+            </w:pPr>
+            <w:r>
+              <w:rPr>
+                <w:rFonts w:ascii="Microsoft JhengHei" w:hAnsi="Microsoft JhengHei"/>
+                <w:b/>
+                <w:color w:val="FFFFFF"/>
+                <w:sz w:val="20"/>
+              </w:rPr>
+              <w:t>階段比對項目</w:t>
+            </w:r>
+          </w:p>
+        </w:tc>
+        <w:tc>
+          <w:tcPr>
+            <w:tcW w:type="dxa" w:w="4514"/>
+            <w:shd w:fill="1B365D"/>
+            <w:tcMar>
+              <w:top w:w="120" w:type="dxa"/>
+              <w:bottom w:w="120" w:type="dxa"/>
+              <w:left w:w="140" w:type="dxa"/>
+              <w:right w:w="140" w:type="dxa"/>
+            </w:tcMar>
+          </w:tcPr>
+          <w:p>
+            <w:pPr>
+              <w:jc w:val="center"/>
+            </w:pPr>
+            <w:r>
+              <w:rPr>
+                <w:rFonts w:ascii="Microsoft JhengHei" w:hAnsi="Microsoft JhengHei"/>
+                <w:b/>
+                <w:color w:val="FFFFFF"/>
+                <w:sz w:val="20"/>
+              </w:rPr>
+              <w:t>Antigravity AI 運算軌跡與實體產出細節說明</w:t>
+            </w:r>
+          </w:p>
+        </w:tc>
+      </w:tr>
+      <w:tr>
+        <w:tc>
+          <w:tcPr>
+            <w:tcW w:type="dxa" w:w="4514"/>
+            <w:shd w:fill="FFFFFF"/>
+            <w:tcMar>
+              <w:top w:w="100" w:type="dxa"/>
+              <w:bottom w:w="100" w:type="dxa"/>
+              <w:left w:w="140" w:type="dxa"/>
+              <w:right w:w="140" w:type="dxa"/>
+            </w:tcMar>
+          </w:tcPr>
+          <w:p>
+            <w:pPr>
+              <w:jc w:val="center"/>
+            </w:pPr>
+            <w:r>
+              <w:rPr>
+                <w:rFonts w:ascii="Microsoft JhengHei" w:hAnsi="Microsoft JhengHei"/>
+                <w:color w:val="2D3748"/>
+                <w:sz w:val="19"/>
+              </w:rPr>
+              <w:t>📥 使用者輸入 Prompt</w:t>
+            </w:r>
+          </w:p>
+        </w:tc>
+        <w:tc>
+          <w:tcPr>
+            <w:tcW w:type="dxa" w:w="4514"/>
+            <w:shd w:fill="FFFFFF"/>
+            <w:tcMar>
+              <w:top w:w="100" w:type="dxa"/>
+              <w:bottom w:w="100" w:type="dxa"/>
+              <w:left w:w="140" w:type="dxa"/>
+              <w:right w:w="140" w:type="dxa"/>
+            </w:tcMar>
+          </w:tcPr>
+          <w:p>
+            <w:r>
+              <w:rPr>
+                <w:rFonts w:ascii="Microsoft JhengHei" w:hAnsi="Microsoft JhengHei"/>
+                <w:color w:val="2D3748"/>
+                <w:sz w:val="19"/>
+              </w:rPr>
+              <w:t>指定『行政法教授』+『單頁 1,000 字/全集 50 萬字』+『python-docx 企業排版』+『100 輪法律驗證』</w:t>
+            </w:r>
+          </w:p>
+        </w:tc>
+      </w:tr>
+      <w:tr>
+        <w:tc>
+          <w:tcPr>
+            <w:tcW w:type="dxa" w:w="4514"/>
+            <w:shd w:fill="F8FAFC"/>
+            <w:tcMar>
+              <w:top w:w="100" w:type="dxa"/>
+              <w:bottom w:w="100" w:type="dxa"/>
+              <w:left w:w="140" w:type="dxa"/>
+              <w:right w:w="140" w:type="dxa"/>
+            </w:tcMar>
+          </w:tcPr>
+          <w:p>
+            <w:pPr>
+              <w:jc w:val="center"/>
+            </w:pPr>
+            <w:r>
+              <w:rPr>
+                <w:rFonts w:ascii="Microsoft JhengHei" w:hAnsi="Microsoft JhengHei"/>
+                <w:color w:val="2D3748"/>
+                <w:sz w:val="19"/>
+              </w:rPr>
+              <w:t>⚙️ AI 執行軌跡 (Trajectory)</w:t>
+            </w:r>
+          </w:p>
+        </w:tc>
+        <w:tc>
+          <w:tcPr>
+            <w:tcW w:type="dxa" w:w="4514"/>
+            <w:shd w:fill="F8FAFC"/>
+            <w:tcMar>
+              <w:top w:w="100" w:type="dxa"/>
+              <w:bottom w:w="100" w:type="dxa"/>
+              <w:left w:w="140" w:type="dxa"/>
+              <w:right w:w="140" w:type="dxa"/>
+            </w:tcMar>
+          </w:tcPr>
+          <w:p>
+            <w:r>
+              <w:rPr>
+                <w:rFonts w:ascii="Microsoft JhengHei" w:hAnsi="Microsoft JhengHei"/>
+                <w:color w:val="2D3748"/>
+                <w:sz w:val="19"/>
+              </w:rPr>
+              <w:t>1. 撰寫生成腳本讀取 500 頁簡報主題。</w:t>
+              <w:br/>
+              <w:t>2. 延伸產出《行政程序法》條文與大法官釋字（如釋字 443 號）。</w:t>
+              <w:br/>
+              <w:t>3. 利用 python-docx 控制 parse_xml 設定深海藍表格。</w:t>
+              <w:br/>
+              <w:t>4. 執行 100 輪稽核腳本確認條號無誤。</w:t>
+            </w:r>
+          </w:p>
+        </w:tc>
+      </w:tr>
+      <w:tr>
+        <w:tc>
+          <w:tcPr>
+            <w:tcW w:type="dxa" w:w="4514"/>
+            <w:shd w:fill="FFFFFF"/>
+            <w:tcMar>
+              <w:top w:w="100" w:type="dxa"/>
+              <w:bottom w:w="100" w:type="dxa"/>
+              <w:left w:w="140" w:type="dxa"/>
+              <w:right w:w="140" w:type="dxa"/>
+            </w:tcMar>
+          </w:tcPr>
+          <w:p>
+            <w:pPr>
+              <w:jc w:val="center"/>
+            </w:pPr>
+            <w:r>
+              <w:rPr>
+                <w:rFonts w:ascii="Microsoft JhengHei" w:hAnsi="Microsoft JhengHei"/>
+                <w:color w:val="2D3748"/>
+                <w:sz w:val="19"/>
+              </w:rPr>
+              <w:t>📤 實體產出成果 (Output)</w:t>
+            </w:r>
+          </w:p>
+        </w:tc>
+        <w:tc>
+          <w:tcPr>
+            <w:tcW w:type="dxa" w:w="4514"/>
+            <w:shd w:fill="FFFFFF"/>
+            <w:tcMar>
+              <w:top w:w="100" w:type="dxa"/>
+              <w:bottom w:w="100" w:type="dxa"/>
+              <w:left w:w="140" w:type="dxa"/>
+              <w:right w:w="140" w:type="dxa"/>
+            </w:tcMar>
+          </w:tcPr>
+          <w:p>
+            <w:r>
+              <w:rPr>
+                <w:rFonts w:ascii="Microsoft JhengHei" w:hAnsi="Microsoft JhengHei"/>
+                <w:color w:val="2D3748"/>
+                <w:sz w:val="19"/>
+              </w:rPr>
+              <w:t>產出行政法500頁旗艦講義_1000字講稿全集.docx (50 萬字巨著)，可以直接在 Microsoft Word 開啟列印與閱讀！</w:t>
+            </w:r>
+          </w:p>
+        </w:tc>
+      </w:tr>
+    </w:tbl>
+    <w:p>
+      <w:pPr>
+        <w:spacing w:before="120" w:after="120"/>
       </w:pPr>
     </w:p>
     <w:p>
@@ -887,7 +2159,7 @@
           <w:color w:val="1B365D"/>
           <w:sz w:val="34"/>
         </w:rPr>
-        <w:t>第四章：50 萬字大書講稿與 Word 全集自動化生成</w:t>
+        <w:t>第五章：30 分鐘特企 Podcast 廣播對談劇本寫作實戰 Prompt 範例</w:t>
       </w:r>
     </w:p>
     <w:p>
@@ -902,7 +2174,7 @@
           <w:color w:val="2C5282"/>
           <w:sz w:val="27"/>
         </w:rPr>
-        <w:t>4.1 50 萬字講稿寫作與 python-docx 自動排版</w:t>
+        <w:t>5.1 行政法男女雙主持 Podcast 劇本 Prompt 模板 3</w:t>
       </w:r>
     </w:p>
     <w:p>
@@ -915,7 +2187,7 @@
           <w:color w:val="2D3748"/>
           <w:sz w:val="22"/>
         </w:rPr>
-        <w:t>每一頁簡報搭配 1,000 字精華講稿與法理延伸，透過 Python python-docx 套件自動生成企業級 Word 文件 (行政法500頁旗艦講義_1000字講稿全集.docx)。</w:t>
+        <w:t>設計男主持人阿哲（YunJhe - 幽默問答）與女法治導師小晨（HsiaoChen - 權威解析）進行輕鬆廣播對談，輸出為 `scratch/podcast_script_30min.json`。</w:t>
       </w:r>
     </w:p>
     <w:tbl>
@@ -957,7 +2229,7 @@
                 <w:color w:val="1B365D"/>
                 <w:sz w:val="22"/>
               </w:rPr>
-              <w:t>[Antigravity 完整提示詞指令模板 (Prompt Template)]  Prompt 模板 2：50 萬字 Word 講稿全集自動化生成完整指令</w:t>
+              <w:t>[行政法專案實戰 Prompt 指令範例模板]  【行政法 30 分鐘男女雙主持 Podcast 劇本 Prompt 範例模板】</w:t>
               <w:br/>
             </w:r>
             <w:r>
@@ -966,17 +2238,21 @@
                 <w:color w:val="2D3748"/>
                 <w:sz w:val="20"/>
               </w:rPr>
-              <w:t>請扮演資深行政法法學教授與 Python 文件自動化開發工程師。</w:t>
+              <w:t>請扮演資深廣播電台節目製作人與行政法教學導師。</w:t>
               <w:br/>
-              <w:t>【目標】：請為 500 頁簡報中的每一頁撰寫 1,000 字的精華延伸講稿（全集共計 500,000 字），並透過 Python python-docx 套件自動生成企業級 Word 文件（行政法500頁旗艦講義_1000字講稿全集.docx）。</w:t>
+              <w:t>【目標】：請撰寫一套長達 30 分鐘（約 13,000 餘字對白）的男女雙主持人廣播對談劇本，並輸出為 scratch/podcast_script_30min.json。</w:t>
+              <w:br/>
+              <w:t>【角色分工】：</w:t>
+              <w:br/>
+              <w:t>- 主持人 阿哲（YunJhe - 男聲）：熱情幽默，從生活時事案例（如高鐵採購、酒駕裁罰、路面坑洞）帶出大眾關心的法理疑問。</w:t>
+              <w:br/>
+              <w:t>- 法治導師 小晨（HsiaoChen - 女聲）：權威專業、條理分明，深入淺出拆解法條要件、大法官解釋與大考解題陷阱。</w:t>
               <w:br/>
               <w:t>【要求】：</w:t>
               <w:br/>
-              <w:t>1. 內容規範：講稿需完整涵蓋《行政程序法》、《行政罰法》、《行政執行法》、《訴願法》、《行政訴訟法》與《國家賠償法》，並融入大法官憲判字與最新考題陷阱說明。</w:t>
+              <w:t>1. 節目架構：涵蓋行政法 10 大核心模組，每單元對談約 3 分鐘。</w:t>
               <w:br/>
-              <w:t>2. 排版樣式：採用深海藍 (#1B365D) 主標題、微軟正黑體 11pt 內文、1.25 倍行高、內嵌法理比較表格與 Matplotlib 統計圖表。</w:t>
-              <w:br/>
-              <w:t>3. 自動化稽核：撰寫 Python 腳本 scratch/verify_100_rounds_docx_taiwan_law.py，對產出的 Word 講稿進行 100 輪臺灣法律條號與專有名詞正確性驗證，確保 100/100 通過！</w:t>
+              <w:t>2. JSON 格式：每一句對白需包含 speaker (阿哲/小晨)、voice (zh-TW-YunJheNeural/zh-TW-HsiaoChenNeural) 與 text 欄位。</w:t>
             </w:r>
           </w:p>
         </w:tc>
@@ -985,6 +2261,245 @@
     <w:p>
       <w:pPr>
         <w:spacing w:before="80" w:after="80"/>
+      </w:pPr>
+    </w:p>
+    <w:p>
+      <w:pPr>
+        <w:keepNext/>
+        <w:spacing w:before="360" w:after="160"/>
+      </w:pPr>
+      <w:r>
+        <w:rPr>
+          <w:rFonts w:ascii="Microsoft JhengHei" w:hAnsi="Microsoft JhengHei"/>
+          <w:b/>
+          <w:color w:val="2C5282"/>
+          <w:sz w:val="27"/>
+        </w:rPr>
+        <w:t>5.2 Prompt 實戰解說與輸入/輸出比對</w:t>
+      </w:r>
+    </w:p>
+    <w:tbl>
+      <w:tblPr>
+        <w:tblW w:type="auto" w:w="0"/>
+        <w:jc w:val="center"/>
+        <w:tblLayout w:type="fixed"/>
+        <w:tblLook w:firstColumn="1" w:firstRow="1" w:lastColumn="0" w:lastRow="0" w:noHBand="0" w:noVBand="1" w:val="04A0"/>
+      </w:tblPr>
+      <w:tblGrid>
+        <w:gridCol w:w="4514"/>
+        <w:gridCol w:w="4514"/>
+      </w:tblGrid>
+      <w:tr>
+        <w:tc>
+          <w:tcPr>
+            <w:tcW w:type="dxa" w:w="4514"/>
+            <w:shd w:fill="1B365D"/>
+            <w:tcMar>
+              <w:top w:w="120" w:type="dxa"/>
+              <w:bottom w:w="120" w:type="dxa"/>
+              <w:left w:w="140" w:type="dxa"/>
+              <w:right w:w="140" w:type="dxa"/>
+            </w:tcMar>
+          </w:tcPr>
+          <w:p>
+            <w:pPr>
+              <w:jc w:val="center"/>
+            </w:pPr>
+            <w:r>
+              <w:rPr>
+                <w:rFonts w:ascii="Microsoft JhengHei" w:hAnsi="Microsoft JhengHei"/>
+                <w:b/>
+                <w:color w:val="FFFFFF"/>
+                <w:sz w:val="20"/>
+              </w:rPr>
+              <w:t>階段比對項目</w:t>
+            </w:r>
+          </w:p>
+        </w:tc>
+        <w:tc>
+          <w:tcPr>
+            <w:tcW w:type="dxa" w:w="4514"/>
+            <w:shd w:fill="1B365D"/>
+            <w:tcMar>
+              <w:top w:w="120" w:type="dxa"/>
+              <w:bottom w:w="120" w:type="dxa"/>
+              <w:left w:w="140" w:type="dxa"/>
+              <w:right w:w="140" w:type="dxa"/>
+            </w:tcMar>
+          </w:tcPr>
+          <w:p>
+            <w:pPr>
+              <w:jc w:val="center"/>
+            </w:pPr>
+            <w:r>
+              <w:rPr>
+                <w:rFonts w:ascii="Microsoft JhengHei" w:hAnsi="Microsoft JhengHei"/>
+                <w:b/>
+                <w:color w:val="FFFFFF"/>
+                <w:sz w:val="20"/>
+              </w:rPr>
+              <w:t>Antigravity AI 運算軌跡與實體產出細節說明</w:t>
+            </w:r>
+          </w:p>
+        </w:tc>
+      </w:tr>
+      <w:tr>
+        <w:tc>
+          <w:tcPr>
+            <w:tcW w:type="dxa" w:w="4514"/>
+            <w:shd w:fill="FFFFFF"/>
+            <w:tcMar>
+              <w:top w:w="100" w:type="dxa"/>
+              <w:bottom w:w="100" w:type="dxa"/>
+              <w:left w:w="140" w:type="dxa"/>
+              <w:right w:w="140" w:type="dxa"/>
+            </w:tcMar>
+          </w:tcPr>
+          <w:p>
+            <w:pPr>
+              <w:jc w:val="center"/>
+            </w:pPr>
+            <w:r>
+              <w:rPr>
+                <w:rFonts w:ascii="Microsoft JhengHei" w:hAnsi="Microsoft JhengHei"/>
+                <w:color w:val="2D3748"/>
+                <w:sz w:val="19"/>
+              </w:rPr>
+              <w:t>📥 使用者輸入 Prompt</w:t>
+            </w:r>
+          </w:p>
+        </w:tc>
+        <w:tc>
+          <w:tcPr>
+            <w:tcW w:type="dxa" w:w="4514"/>
+            <w:shd w:fill="FFFFFF"/>
+            <w:tcMar>
+              <w:top w:w="100" w:type="dxa"/>
+              <w:bottom w:w="100" w:type="dxa"/>
+              <w:left w:w="140" w:type="dxa"/>
+              <w:right w:w="140" w:type="dxa"/>
+            </w:tcMar>
+          </w:tcPr>
+          <w:p>
+            <w:r>
+              <w:rPr>
+                <w:rFonts w:ascii="Microsoft JhengHei" w:hAnsi="Microsoft JhengHei"/>
+                <w:color w:val="2D3748"/>
+                <w:sz w:val="19"/>
+              </w:rPr>
+              <w:t>指定『電台製作人』+『阿哲男聲 vs 小晨女聲』+『13,000 字對白』+『podcast_script_30min.json』</w:t>
+            </w:r>
+          </w:p>
+        </w:tc>
+      </w:tr>
+      <w:tr>
+        <w:tc>
+          <w:tcPr>
+            <w:tcW w:type="dxa" w:w="4514"/>
+            <w:shd w:fill="F8FAFC"/>
+            <w:tcMar>
+              <w:top w:w="100" w:type="dxa"/>
+              <w:bottom w:w="100" w:type="dxa"/>
+              <w:left w:w="140" w:type="dxa"/>
+              <w:right w:w="140" w:type="dxa"/>
+            </w:tcMar>
+          </w:tcPr>
+          <w:p>
+            <w:pPr>
+              <w:jc w:val="center"/>
+            </w:pPr>
+            <w:r>
+              <w:rPr>
+                <w:rFonts w:ascii="Microsoft JhengHei" w:hAnsi="Microsoft JhengHei"/>
+                <w:color w:val="2D3748"/>
+                <w:sz w:val="19"/>
+              </w:rPr>
+              <w:t>⚙️ AI 執行軌跡 (Trajectory)</w:t>
+            </w:r>
+          </w:p>
+        </w:tc>
+        <w:tc>
+          <w:tcPr>
+            <w:tcW w:type="dxa" w:w="4514"/>
+            <w:shd w:fill="F8FAFC"/>
+            <w:tcMar>
+              <w:top w:w="100" w:type="dxa"/>
+              <w:bottom w:w="100" w:type="dxa"/>
+              <w:left w:w="140" w:type="dxa"/>
+              <w:right w:w="140" w:type="dxa"/>
+            </w:tcMar>
+          </w:tcPr>
+          <w:p>
+            <w:r>
+              <w:rPr>
+                <w:rFonts w:ascii="Microsoft JhengHei" w:hAnsi="Microsoft JhengHei"/>
+                <w:color w:val="2D3748"/>
+                <w:sz w:val="19"/>
+              </w:rPr>
+              <w:t>1. 拆解行政法 10 大模組時間軸 (每單元約 3 分鐘)。</w:t>
+              <w:br/>
+              <w:t>2. 撰寫【阿哲】提問與【小晨】權威解析對白。</w:t>
+              <w:br/>
+              <w:t>3. 為每條對白綁定 zh-TW-YunJheNeural 或 zh-TW-HsiaoChenNeural 語音代碼。</w:t>
+              <w:br/>
+              <w:t>4. 寫入 JSON 格式檔案。</w:t>
+            </w:r>
+          </w:p>
+        </w:tc>
+      </w:tr>
+      <w:tr>
+        <w:tc>
+          <w:tcPr>
+            <w:tcW w:type="dxa" w:w="4514"/>
+            <w:shd w:fill="FFFFFF"/>
+            <w:tcMar>
+              <w:top w:w="100" w:type="dxa"/>
+              <w:bottom w:w="100" w:type="dxa"/>
+              <w:left w:w="140" w:type="dxa"/>
+              <w:right w:w="140" w:type="dxa"/>
+            </w:tcMar>
+          </w:tcPr>
+          <w:p>
+            <w:pPr>
+              <w:jc w:val="center"/>
+            </w:pPr>
+            <w:r>
+              <w:rPr>
+                <w:rFonts w:ascii="Microsoft JhengHei" w:hAnsi="Microsoft JhengHei"/>
+                <w:color w:val="2D3748"/>
+                <w:sz w:val="19"/>
+              </w:rPr>
+              <w:t>📤 實體產出成果 (Output)</w:t>
+            </w:r>
+          </w:p>
+        </w:tc>
+        <w:tc>
+          <w:tcPr>
+            <w:tcW w:type="dxa" w:w="4514"/>
+            <w:shd w:fill="FFFFFF"/>
+            <w:tcMar>
+              <w:top w:w="100" w:type="dxa"/>
+              <w:bottom w:w="100" w:type="dxa"/>
+              <w:left w:w="140" w:type="dxa"/>
+              <w:right w:w="140" w:type="dxa"/>
+            </w:tcMar>
+          </w:tcPr>
+          <w:p>
+            <w:r>
+              <w:rPr>
+                <w:rFonts w:ascii="Microsoft JhengHei" w:hAnsi="Microsoft JhengHei"/>
+                <w:color w:val="2D3748"/>
+                <w:sz w:val="19"/>
+              </w:rPr>
+              <w:t>產出 scratch/podcast_script_30min.json，內含 13,000 餘字帶有聲音標籤之對白結構，作為 TTS 合成輸入！</w:t>
+            </w:r>
+          </w:p>
+        </w:tc>
+      </w:tr>
+    </w:tbl>
+    <w:p>
+      <w:pPr>
+        <w:spacing w:before="120" w:after="120"/>
       </w:pPr>
     </w:p>
     <w:p>
@@ -1004,7 +2519,7 @@
           <w:color w:val="1B365D"/>
           <w:sz w:val="34"/>
         </w:rPr>
-        <w:t>第五章：30 分鐘特企 Podcast 廣播對談劇本寫作與聲學設計</w:t>
+        <w:t>第六章：Microsoft Azure Neural 神經語音 TTS 語音合成與語速校準 Prompt 範例</w:t>
       </w:r>
     </w:p>
     <w:p>
@@ -1019,7 +2534,7 @@
           <w:color w:val="2C5282"/>
           <w:sz w:val="27"/>
         </w:rPr>
-        <w:t>5.1 雙主持人角色設定與 13,000 字劇本寫作</w:t>
+        <w:t>6.1 雙語音合成與語速校準 Prompt 模板 4</w:t>
       </w:r>
     </w:p>
     <w:p>
@@ -1032,7 +2547,62 @@
           <w:color w:val="2D3748"/>
           <w:sz w:val="22"/>
         </w:rPr>
-        <w:t>設計男主持人阿哲（YunJhe - 幽默問答）與女法治導師小晨（HsiaoChen - 權威解析）進行輕鬆廣播對談，輸出為 scratch/podcast_script_30min.json。</w:t>
+        <w:t>經實測，選用 rate='-15%'（每秒約 4.2 字）作為成年人自然日常廣播語速，結合二進位流合併為 podcast_audio_30min.mp3 (9.18 MB)。</w:t>
+      </w:r>
+    </w:p>
+    <w:p>
+      <w:pPr>
+        <w:spacing w:before="200" w:after="80"/>
+        <w:jc w:val="center"/>
+      </w:pPr>
+      <w:r>
+        <w:drawing>
+          <wp:inline xmlns:a="http://schemas.openxmlformats.org/drawingml/2006/main" xmlns:pic="http://schemas.openxmlformats.org/drawingml/2006/picture">
+            <wp:extent cx="5669280" cy="3188970"/>
+            <wp:docPr id="2" name="Picture 2"/>
+            <wp:cNvGraphicFramePr>
+              <a:graphicFrameLocks noChangeAspect="1"/>
+            </wp:cNvGraphicFramePr>
+            <a:graphic>
+              <a:graphicData uri="http://schemas.openxmlformats.org/drawingml/2006/picture">
+                <pic:pic>
+                  <pic:nvPicPr>
+                    <pic:cNvPr id="0" name="speech_rate_cps_chart.png"/>
+                    <pic:cNvPicPr/>
+                  </pic:nvPicPr>
+                  <pic:blipFill>
+                    <a:blip r:embed="rId10"/>
+                    <a:stretch>
+                      <a:fillRect/>
+                    </a:stretch>
+                  </pic:blipFill>
+                  <pic:spPr>
+                    <a:xfrm>
+                      <a:off x="0" y="0"/>
+                      <a:ext cx="5669280" cy="3188970"/>
+                    </a:xfrm>
+                    <a:prstGeom prst="rect"/>
+                  </pic:spPr>
+                </pic:pic>
+              </a:graphicData>
+            </a:graphic>
+          </wp:inline>
+        </w:drawing>
+      </w:r>
+    </w:p>
+    <w:p>
+      <w:pPr>
+        <w:spacing w:after="200"/>
+        <w:jc w:val="center"/>
+      </w:pPr>
+      <w:r>
+        <w:rPr>
+          <w:rFonts w:ascii="Microsoft JhengHei" w:hAnsi="Microsoft JhengHei"/>
+          <w:i/>
+          <w:color w:val="2C5282"/>
+          <w:sz w:val="19"/>
+        </w:rPr>
+        <w:t>圖 6.1：Microsoft Azure Neural 語音語速與朗讀效率實測比較圖</w:t>
       </w:r>
     </w:p>
     <w:tbl>
@@ -1074,128 +2644,7 @@
                 <w:color w:val="1B365D"/>
                 <w:sz w:val="22"/>
               </w:rPr>
-              <w:t>[Antigravity 完整提示詞指令模板 (Prompt Template)]  Prompt 模板 3：30 分鐘特企男女雙主持 Podcast 廣播劇本完整指令</w:t>
-              <w:br/>
-            </w:r>
-            <w:r>
-              <w:rPr>
-                <w:rFonts w:ascii="Microsoft JhengHei" w:hAnsi="Microsoft JhengHei"/>
-                <w:color w:val="2D3748"/>
-                <w:sz w:val="20"/>
-              </w:rPr>
-              <w:t>請扮演資深廣播電台節目製作人與行政法教學導師。</w:t>
-              <w:br/>
-              <w:t>【目標】：請撰寫一套長達 30 分鐘（約 13,000 餘字對白）的男女雙主持人廣播對談劇本，並輸出為 scratch/podcast_script_30min.json。</w:t>
-              <w:br/>
-              <w:t>【角色分工】：</w:t>
-              <w:br/>
-              <w:t>- 主持人 阿哲（YunJhe - 男聲）：熱情幽默，從生活時事案例（如高鐵採購、酒駕裁罰、路面坑洞）帶出大眾關心的法理疑問。</w:t>
-              <w:br/>
-              <w:t>- 法治導師 小晨（HsiaoChen - 女聲）：權威專業、條理分明，深入淺出拆解法條要件、大法官解釋與大考解題陷阱。</w:t>
-              <w:br/>
-              <w:t>【要求】：</w:t>
-              <w:br/>
-              <w:t>1. 節目架構：涵蓋行政法 10 大核心模組，每單元對談約 3 分鐘。</w:t>
-              <w:br/>
-              <w:t>2. JSON 格式：每一句對白需包含 speaker (阿哲/小晨)、voice (zh-TW-YunJheNeural/zh-TW-HsiaoChenNeural) 與 text 欄位。</w:t>
-            </w:r>
-          </w:p>
-        </w:tc>
-      </w:tr>
-    </w:tbl>
-    <w:p>
-      <w:pPr>
-        <w:spacing w:before="80" w:after="80"/>
-      </w:pPr>
-    </w:p>
-    <w:p>
-      <w:r>
-        <w:br w:type="page"/>
-      </w:r>
-    </w:p>
-    <w:p>
-      <w:pPr>
-        <w:keepNext/>
-        <w:spacing w:before="520" w:after="240"/>
-      </w:pPr>
-      <w:r>
-        <w:rPr>
-          <w:rFonts w:ascii="Microsoft JhengHei" w:hAnsi="Microsoft JhengHei"/>
-          <w:b/>
-          <w:color w:val="1B365D"/>
-          <w:sz w:val="34"/>
-        </w:rPr>
-        <w:t>第六章：Microsoft Azure Neural 神經語音 TTS 語音合成與語速校準</w:t>
-      </w:r>
-    </w:p>
-    <w:p>
-      <w:pPr>
-        <w:keepNext/>
-        <w:spacing w:before="360" w:after="160"/>
-      </w:pPr>
-      <w:r>
-        <w:rPr>
-          <w:rFonts w:ascii="Microsoft JhengHei" w:hAnsi="Microsoft JhengHei"/>
-          <w:b/>
-          <w:color w:val="2C5282"/>
-          <w:sz w:val="27"/>
-        </w:rPr>
-        <w:t>6.1 edge-tts 語速校準實驗與雙聲道合成</w:t>
-      </w:r>
-    </w:p>
-    <w:p>
-      <w:pPr>
-        <w:spacing w:after="140" w:line="300" w:lineRule="auto"/>
-      </w:pPr>
-      <w:r>
-        <w:rPr>
-          <w:rFonts w:ascii="Microsoft JhengHei" w:hAnsi="Microsoft JhengHei"/>
-          <w:color w:val="2D3748"/>
-          <w:sz w:val="22"/>
-        </w:rPr>
-        <w:t>經實測，選用 rate='-15%'（每秒約 4.2 字）作為成年人自然日常廣播語速，結合二進位流合併為 podcast_audio_30min.mp3 (9.18 MB)。</w:t>
-      </w:r>
-    </w:p>
-    <w:tbl>
-      <w:tblPr>
-        <w:tblW w:type="auto" w:w="0"/>
-        <w:jc w:val="center"/>
-        <w:tblLayout w:type="fixed"/>
-        <w:tblLook w:firstColumn="1" w:firstRow="1" w:lastColumn="0" w:lastRow="0" w:noHBand="0" w:noVBand="1" w:val="04A0"/>
-      </w:tblPr>
-      <w:tblGrid>
-        <w:gridCol w:w="9029"/>
-      </w:tblGrid>
-      <w:tr>
-        <w:tc>
-          <w:tcPr>
-            <w:tcW w:type="dxa" w:w="9029"/>
-            <w:tcMar>
-              <w:top w:w="140" w:type="dxa"/>
-              <w:bottom w:w="140" w:type="dxa"/>
-              <w:left w:w="200" w:type="dxa"/>
-              <w:right w:w="200" w:type="dxa"/>
-            </w:tcMar>
-            <w:shd w:fill="ECFDF5"/>
-            <w:tcBorders>
-              <w:top w:val="none"/>
-              <w:left w:val="single" w:sz="36" w:space="0" w:color="059669"/>
-              <w:bottom w:val="none"/>
-              <w:right w:val="none"/>
-            </w:tcBorders>
-          </w:tcPr>
-          <w:p>
-            <w:pPr>
-              <w:spacing w:after="80"/>
-            </w:pPr>
-            <w:r>
-              <w:rPr>
-                <w:rFonts w:ascii="Microsoft JhengHei" w:hAnsi="Microsoft JhengHei"/>
-                <w:b/>
-                <w:color w:val="1B365D"/>
-                <w:sz w:val="22"/>
-              </w:rPr>
-              <w:t>[Antigravity 完整提示詞指令模板 (Prompt Template)]  Prompt 模板 4：Azure Neural 雙語音合成與語速校準完整指令</w:t>
+              <w:t>[行政法專案實戰 Prompt 指令範例模板]  【Azure Neural 雙語音合成與語速校準 Prompt 範例模板】</w:t>
               <w:br/>
             </w:r>
             <w:r>
@@ -1226,6 +2675,245 @@
       </w:pPr>
     </w:p>
     <w:p>
+      <w:pPr>
+        <w:keepNext/>
+        <w:spacing w:before="360" w:after="160"/>
+      </w:pPr>
+      <w:r>
+        <w:rPr>
+          <w:rFonts w:ascii="Microsoft JhengHei" w:hAnsi="Microsoft JhengHei"/>
+          <w:b/>
+          <w:color w:val="2C5282"/>
+          <w:sz w:val="27"/>
+        </w:rPr>
+        <w:t>6.2 Prompt 實戰解說與輸入/輸出比對</w:t>
+      </w:r>
+    </w:p>
+    <w:tbl>
+      <w:tblPr>
+        <w:tblW w:type="auto" w:w="0"/>
+        <w:jc w:val="center"/>
+        <w:tblLayout w:type="fixed"/>
+        <w:tblLook w:firstColumn="1" w:firstRow="1" w:lastColumn="0" w:lastRow="0" w:noHBand="0" w:noVBand="1" w:val="04A0"/>
+      </w:tblPr>
+      <w:tblGrid>
+        <w:gridCol w:w="4514"/>
+        <w:gridCol w:w="4514"/>
+      </w:tblGrid>
+      <w:tr>
+        <w:tc>
+          <w:tcPr>
+            <w:tcW w:type="dxa" w:w="4514"/>
+            <w:shd w:fill="1B365D"/>
+            <w:tcMar>
+              <w:top w:w="120" w:type="dxa"/>
+              <w:bottom w:w="120" w:type="dxa"/>
+              <w:left w:w="140" w:type="dxa"/>
+              <w:right w:w="140" w:type="dxa"/>
+            </w:tcMar>
+          </w:tcPr>
+          <w:p>
+            <w:pPr>
+              <w:jc w:val="center"/>
+            </w:pPr>
+            <w:r>
+              <w:rPr>
+                <w:rFonts w:ascii="Microsoft JhengHei" w:hAnsi="Microsoft JhengHei"/>
+                <w:b/>
+                <w:color w:val="FFFFFF"/>
+                <w:sz w:val="20"/>
+              </w:rPr>
+              <w:t>階段比對項目</w:t>
+            </w:r>
+          </w:p>
+        </w:tc>
+        <w:tc>
+          <w:tcPr>
+            <w:tcW w:type="dxa" w:w="4514"/>
+            <w:shd w:fill="1B365D"/>
+            <w:tcMar>
+              <w:top w:w="120" w:type="dxa"/>
+              <w:bottom w:w="120" w:type="dxa"/>
+              <w:left w:w="140" w:type="dxa"/>
+              <w:right w:w="140" w:type="dxa"/>
+            </w:tcMar>
+          </w:tcPr>
+          <w:p>
+            <w:pPr>
+              <w:jc w:val="center"/>
+            </w:pPr>
+            <w:r>
+              <w:rPr>
+                <w:rFonts w:ascii="Microsoft JhengHei" w:hAnsi="Microsoft JhengHei"/>
+                <w:b/>
+                <w:color w:val="FFFFFF"/>
+                <w:sz w:val="20"/>
+              </w:rPr>
+              <w:t>Antigravity AI 運算軌跡與實體產出細節說明</w:t>
+            </w:r>
+          </w:p>
+        </w:tc>
+      </w:tr>
+      <w:tr>
+        <w:tc>
+          <w:tcPr>
+            <w:tcW w:type="dxa" w:w="4514"/>
+            <w:shd w:fill="FFFFFF"/>
+            <w:tcMar>
+              <w:top w:w="100" w:type="dxa"/>
+              <w:bottom w:w="100" w:type="dxa"/>
+              <w:left w:w="140" w:type="dxa"/>
+              <w:right w:w="140" w:type="dxa"/>
+            </w:tcMar>
+          </w:tcPr>
+          <w:p>
+            <w:pPr>
+              <w:jc w:val="center"/>
+            </w:pPr>
+            <w:r>
+              <w:rPr>
+                <w:rFonts w:ascii="Microsoft JhengHei" w:hAnsi="Microsoft JhengHei"/>
+                <w:color w:val="2D3748"/>
+                <w:sz w:val="19"/>
+              </w:rPr>
+              <w:t>📥 使用者輸入 Prompt</w:t>
+            </w:r>
+          </w:p>
+        </w:tc>
+        <w:tc>
+          <w:tcPr>
+            <w:tcW w:type="dxa" w:w="4514"/>
+            <w:shd w:fill="FFFFFF"/>
+            <w:tcMar>
+              <w:top w:w="100" w:type="dxa"/>
+              <w:bottom w:w="100" w:type="dxa"/>
+              <w:left w:w="140" w:type="dxa"/>
+              <w:right w:w="140" w:type="dxa"/>
+            </w:tcMar>
+          </w:tcPr>
+          <w:p>
+            <w:r>
+              <w:rPr>
+                <w:rFonts w:ascii="Microsoft JhengHei" w:hAnsi="Microsoft JhengHei"/>
+                <w:color w:val="2D3748"/>
+                <w:sz w:val="19"/>
+              </w:rPr>
+              <w:t>指定『edge-tts 合成』+『rate=-15% 成年人電台語速』+『try...except 重試』+『MP3 Frame Header 計算時間軸』</w:t>
+            </w:r>
+          </w:p>
+        </w:tc>
+      </w:tr>
+      <w:tr>
+        <w:tc>
+          <w:tcPr>
+            <w:tcW w:type="dxa" w:w="4514"/>
+            <w:shd w:fill="F8FAFC"/>
+            <w:tcMar>
+              <w:top w:w="100" w:type="dxa"/>
+              <w:bottom w:w="100" w:type="dxa"/>
+              <w:left w:w="140" w:type="dxa"/>
+              <w:right w:w="140" w:type="dxa"/>
+            </w:tcMar>
+          </w:tcPr>
+          <w:p>
+            <w:pPr>
+              <w:jc w:val="center"/>
+            </w:pPr>
+            <w:r>
+              <w:rPr>
+                <w:rFonts w:ascii="Microsoft JhengHei" w:hAnsi="Microsoft JhengHei"/>
+                <w:color w:val="2D3748"/>
+                <w:sz w:val="19"/>
+              </w:rPr>
+              <w:t>⚙️ AI 執行軌跡 (Trajectory)</w:t>
+            </w:r>
+          </w:p>
+        </w:tc>
+        <w:tc>
+          <w:tcPr>
+            <w:tcW w:type="dxa" w:w="4514"/>
+            <w:shd w:fill="F8FAFC"/>
+            <w:tcMar>
+              <w:top w:w="100" w:type="dxa"/>
+              <w:bottom w:w="100" w:type="dxa"/>
+              <w:left w:w="140" w:type="dxa"/>
+              <w:right w:w="140" w:type="dxa"/>
+            </w:tcMar>
+          </w:tcPr>
+          <w:p>
+            <w:r>
+              <w:rPr>
+                <w:rFonts w:ascii="Microsoft JhengHei" w:hAnsi="Microsoft JhengHei"/>
+                <w:color w:val="2D3748"/>
+                <w:sz w:val="19"/>
+              </w:rPr>
+              <w:t>1. 執行 test_calibrate_rate.py 確定每秒 4.2 字率。</w:t>
+              <w:br/>
+              <w:t>2. 執行 synthesize_dual_host_robust.py 批次合成 MP3 片段。</w:t>
+              <w:br/>
+              <w:t>3. 以二進位流合併為 podcast_audio_30min.mp3。</w:t>
+              <w:br/>
+              <w:t>4. 計算每章節起訖時間寫入 exact_synced_chapters.json。</w:t>
+            </w:r>
+          </w:p>
+        </w:tc>
+      </w:tr>
+      <w:tr>
+        <w:tc>
+          <w:tcPr>
+            <w:tcW w:type="dxa" w:w="4514"/>
+            <w:shd w:fill="FFFFFF"/>
+            <w:tcMar>
+              <w:top w:w="100" w:type="dxa"/>
+              <w:bottom w:w="100" w:type="dxa"/>
+              <w:left w:w="140" w:type="dxa"/>
+              <w:right w:w="140" w:type="dxa"/>
+            </w:tcMar>
+          </w:tcPr>
+          <w:p>
+            <w:pPr>
+              <w:jc w:val="center"/>
+            </w:pPr>
+            <w:r>
+              <w:rPr>
+                <w:rFonts w:ascii="Microsoft JhengHei" w:hAnsi="Microsoft JhengHei"/>
+                <w:color w:val="2D3748"/>
+                <w:sz w:val="19"/>
+              </w:rPr>
+              <w:t>📤 實體產出成果 (Output)</w:t>
+            </w:r>
+          </w:p>
+        </w:tc>
+        <w:tc>
+          <w:tcPr>
+            <w:tcW w:type="dxa" w:w="4514"/>
+            <w:shd w:fill="FFFFFF"/>
+            <w:tcMar>
+              <w:top w:w="100" w:type="dxa"/>
+              <w:bottom w:w="100" w:type="dxa"/>
+              <w:left w:w="140" w:type="dxa"/>
+              <w:right w:w="140" w:type="dxa"/>
+            </w:tcMar>
+          </w:tcPr>
+          <w:p>
+            <w:r>
+              <w:rPr>
+                <w:rFonts w:ascii="Microsoft JhengHei" w:hAnsi="Microsoft JhengHei"/>
+                <w:color w:val="2D3748"/>
+                <w:sz w:val="19"/>
+              </w:rPr>
+              <w:t>產出 30 分鐘實體音訊 podcast_audio_30min.mp3 (9.18 MB) 與毫秒級時間軸 JSON，聲音自然流暢無機械感！</w:t>
+            </w:r>
+          </w:p>
+        </w:tc>
+      </w:tr>
+    </w:tbl>
+    <w:p>
+      <w:pPr>
+        <w:spacing w:before="120" w:after="120"/>
+      </w:pPr>
+    </w:p>
+    <w:p>
       <w:r>
         <w:br w:type="page"/>
       </w:r>
@@ -1242,7 +2930,7 @@
           <w:color w:val="1B365D"/>
           <w:sz w:val="34"/>
         </w:rPr>
-        <w:t>第七章：雙引擎網頁版 Podcast 播放器 (podcast_player.html) 開發</w:t>
+        <w:t>第七章：雙引擎網頁版 Podcast 播放器 (podcast_player.html) 開發 Prompt 範例</w:t>
       </w:r>
     </w:p>
     <w:p>
@@ -1257,7 +2945,7 @@
           <w:color w:val="2C5282"/>
           <w:sz w:val="27"/>
         </w:rPr>
-        <w:t>7.1 雙引擎機制與 Canvas 動態頻譜波形</w:t>
+        <w:t>7.1 行政法 Podcast 網頁播放器 Prompt 模板 5</w:t>
       </w:r>
     </w:p>
     <w:p>
@@ -1312,7 +3000,7 @@
                 <w:color w:val="1B365D"/>
                 <w:sz w:val="22"/>
               </w:rPr>
-              <w:t>[Antigravity 完整提示詞指令模板 (Prompt Template)]  Prompt 模板 5：雙引擎網頁版 Podcast 播放器開發完整指令</w:t>
+              <w:t>[行政法專案實戰 Prompt 指令範例模板]  【雙引擎網頁版 Podcast 播放器開發 Prompt 範例模板】</w:t>
               <w:br/>
             </w:r>
             <w:r>
@@ -1345,6 +3033,245 @@
       </w:pPr>
     </w:p>
     <w:p>
+      <w:pPr>
+        <w:keepNext/>
+        <w:spacing w:before="360" w:after="160"/>
+      </w:pPr>
+      <w:r>
+        <w:rPr>
+          <w:rFonts w:ascii="Microsoft JhengHei" w:hAnsi="Microsoft JhengHei"/>
+          <w:b/>
+          <w:color w:val="2C5282"/>
+          <w:sz w:val="27"/>
+        </w:rPr>
+        <w:t>7.2 Prompt 實戰解說與輸入/輸出比對</w:t>
+      </w:r>
+    </w:p>
+    <w:tbl>
+      <w:tblPr>
+        <w:tblW w:type="auto" w:w="0"/>
+        <w:jc w:val="center"/>
+        <w:tblLayout w:type="fixed"/>
+        <w:tblLook w:firstColumn="1" w:firstRow="1" w:lastColumn="0" w:lastRow="0" w:noHBand="0" w:noVBand="1" w:val="04A0"/>
+      </w:tblPr>
+      <w:tblGrid>
+        <w:gridCol w:w="4514"/>
+        <w:gridCol w:w="4514"/>
+      </w:tblGrid>
+      <w:tr>
+        <w:tc>
+          <w:tcPr>
+            <w:tcW w:type="dxa" w:w="4514"/>
+            <w:shd w:fill="1B365D"/>
+            <w:tcMar>
+              <w:top w:w="120" w:type="dxa"/>
+              <w:bottom w:w="120" w:type="dxa"/>
+              <w:left w:w="140" w:type="dxa"/>
+              <w:right w:w="140" w:type="dxa"/>
+            </w:tcMar>
+          </w:tcPr>
+          <w:p>
+            <w:pPr>
+              <w:jc w:val="center"/>
+            </w:pPr>
+            <w:r>
+              <w:rPr>
+                <w:rFonts w:ascii="Microsoft JhengHei" w:hAnsi="Microsoft JhengHei"/>
+                <w:b/>
+                <w:color w:val="FFFFFF"/>
+                <w:sz w:val="20"/>
+              </w:rPr>
+              <w:t>階段比對項目</w:t>
+            </w:r>
+          </w:p>
+        </w:tc>
+        <w:tc>
+          <w:tcPr>
+            <w:tcW w:type="dxa" w:w="4514"/>
+            <w:shd w:fill="1B365D"/>
+            <w:tcMar>
+              <w:top w:w="120" w:type="dxa"/>
+              <w:bottom w:w="120" w:type="dxa"/>
+              <w:left w:w="140" w:type="dxa"/>
+              <w:right w:w="140" w:type="dxa"/>
+            </w:tcMar>
+          </w:tcPr>
+          <w:p>
+            <w:pPr>
+              <w:jc w:val="center"/>
+            </w:pPr>
+            <w:r>
+              <w:rPr>
+                <w:rFonts w:ascii="Microsoft JhengHei" w:hAnsi="Microsoft JhengHei"/>
+                <w:b/>
+                <w:color w:val="FFFFFF"/>
+                <w:sz w:val="20"/>
+              </w:rPr>
+              <w:t>Antigravity AI 運算軌跡與實體產出細節說明</w:t>
+            </w:r>
+          </w:p>
+        </w:tc>
+      </w:tr>
+      <w:tr>
+        <w:tc>
+          <w:tcPr>
+            <w:tcW w:type="dxa" w:w="4514"/>
+            <w:shd w:fill="FFFFFF"/>
+            <w:tcMar>
+              <w:top w:w="100" w:type="dxa"/>
+              <w:bottom w:w="100" w:type="dxa"/>
+              <w:left w:w="140" w:type="dxa"/>
+              <w:right w:w="140" w:type="dxa"/>
+            </w:tcMar>
+          </w:tcPr>
+          <w:p>
+            <w:pPr>
+              <w:jc w:val="center"/>
+            </w:pPr>
+            <w:r>
+              <w:rPr>
+                <w:rFonts w:ascii="Microsoft JhengHei" w:hAnsi="Microsoft JhengHei"/>
+                <w:color w:val="2D3748"/>
+                <w:sz w:val="19"/>
+              </w:rPr>
+              <w:t>📥 使用者輸入 Prompt</w:t>
+            </w:r>
+          </w:p>
+        </w:tc>
+        <w:tc>
+          <w:tcPr>
+            <w:tcW w:type="dxa" w:w="4514"/>
+            <w:shd w:fill="FFFFFF"/>
+            <w:tcMar>
+              <w:top w:w="100" w:type="dxa"/>
+              <w:bottom w:w="100" w:type="dxa"/>
+              <w:left w:w="140" w:type="dxa"/>
+              <w:right w:w="140" w:type="dxa"/>
+            </w:tcMar>
+          </w:tcPr>
+          <w:p>
+            <w:r>
+              <w:rPr>
+                <w:rFonts w:ascii="Microsoft JhengHei" w:hAnsi="Microsoft JhengHei"/>
+                <w:color w:val="2D3748"/>
+                <w:sz w:val="19"/>
+              </w:rPr>
+              <w:t>指定『雙引擎備援』+『Canvas 頻譜視覺化』+『雙向時間軸毫秒同步』+『男女雙主持逐字稿高亮』</w:t>
+            </w:r>
+          </w:p>
+        </w:tc>
+      </w:tr>
+      <w:tr>
+        <w:tc>
+          <w:tcPr>
+            <w:tcW w:type="dxa" w:w="4514"/>
+            <w:shd w:fill="F8FAFC"/>
+            <w:tcMar>
+              <w:top w:w="100" w:type="dxa"/>
+              <w:bottom w:w="100" w:type="dxa"/>
+              <w:left w:w="140" w:type="dxa"/>
+              <w:right w:w="140" w:type="dxa"/>
+            </w:tcMar>
+          </w:tcPr>
+          <w:p>
+            <w:pPr>
+              <w:jc w:val="center"/>
+            </w:pPr>
+            <w:r>
+              <w:rPr>
+                <w:rFonts w:ascii="Microsoft JhengHei" w:hAnsi="Microsoft JhengHei"/>
+                <w:color w:val="2D3748"/>
+                <w:sz w:val="19"/>
+              </w:rPr>
+              <w:t>⚙️ AI 執行軌跡 (Trajectory)</w:t>
+            </w:r>
+          </w:p>
+        </w:tc>
+        <w:tc>
+          <w:tcPr>
+            <w:tcW w:type="dxa" w:w="4514"/>
+            <w:shd w:fill="F8FAFC"/>
+            <w:tcMar>
+              <w:top w:w="100" w:type="dxa"/>
+              <w:bottom w:w="100" w:type="dxa"/>
+              <w:left w:w="140" w:type="dxa"/>
+              <w:right w:w="140" w:type="dxa"/>
+            </w:tcMar>
+          </w:tcPr>
+          <w:p>
+            <w:r>
+              <w:rPr>
+                <w:rFonts w:ascii="Microsoft JhengHei" w:hAnsi="Microsoft JhengHei"/>
+                <w:color w:val="2D3748"/>
+                <w:sz w:val="19"/>
+              </w:rPr>
+              <w:t>1. 撰寫 podcast_player.html DOM 結構。</w:t>
+              <w:br/>
+              <w:t>2. 撰寫 Web Audio API 與 Canvas 藍金發光波形繪製邏輯。</w:t>
+              <w:br/>
+              <w:t>3. 監聽 currentTime 事件比對 exact_synced_chapters.json 時間點。</w:t>
+              <w:br/>
+              <w:t>4. 實現點擊卡片跳轉播放。</w:t>
+            </w:r>
+          </w:p>
+        </w:tc>
+      </w:tr>
+      <w:tr>
+        <w:tc>
+          <w:tcPr>
+            <w:tcW w:type="dxa" w:w="4514"/>
+            <w:shd w:fill="FFFFFF"/>
+            <w:tcMar>
+              <w:top w:w="100" w:type="dxa"/>
+              <w:bottom w:w="100" w:type="dxa"/>
+              <w:left w:w="140" w:type="dxa"/>
+              <w:right w:w="140" w:type="dxa"/>
+            </w:tcMar>
+          </w:tcPr>
+          <w:p>
+            <w:pPr>
+              <w:jc w:val="center"/>
+            </w:pPr>
+            <w:r>
+              <w:rPr>
+                <w:rFonts w:ascii="Microsoft JhengHei" w:hAnsi="Microsoft JhengHei"/>
+                <w:color w:val="2D3748"/>
+                <w:sz w:val="19"/>
+              </w:rPr>
+              <w:t>📤 實體產出成果 (Output)</w:t>
+            </w:r>
+          </w:p>
+        </w:tc>
+        <w:tc>
+          <w:tcPr>
+            <w:tcW w:type="dxa" w:w="4514"/>
+            <w:shd w:fill="FFFFFF"/>
+            <w:tcMar>
+              <w:top w:w="100" w:type="dxa"/>
+              <w:bottom w:w="100" w:type="dxa"/>
+              <w:left w:w="140" w:type="dxa"/>
+              <w:right w:w="140" w:type="dxa"/>
+            </w:tcMar>
+          </w:tcPr>
+          <w:p>
+            <w:r>
+              <w:rPr>
+                <w:rFonts w:ascii="Microsoft JhengHei" w:hAnsi="Microsoft JhengHei"/>
+                <w:color w:val="2D3748"/>
+                <w:sz w:val="19"/>
+              </w:rPr>
+              <w:t>產出完整網頁播放器 podcast_player.html，在任何瀏覽器開啟均可雙向點擊跳轉並同步觀看雙主持對白！</w:t>
+            </w:r>
+          </w:p>
+        </w:tc>
+      </w:tr>
+    </w:tbl>
+    <w:p>
+      <w:pPr>
+        <w:spacing w:before="120" w:after="120"/>
+      </w:pPr>
+    </w:p>
+    <w:p>
       <w:r>
         <w:br w:type="page"/>
       </w:r>
@@ -1361,7 +3288,7 @@
           <w:color w:val="1B365D"/>
           <w:sz w:val="34"/>
         </w:rPr>
-        <w:t>第八章：100 輪與 50 輪自動化測試驗證與品質監控</w:t>
+        <w:t>第八章：100 輪與 50 輪自動化測試驗證與品質監控 Prompt 範例</w:t>
       </w:r>
     </w:p>
     <w:p>
@@ -1376,7 +3303,7 @@
           <w:color w:val="2C5282"/>
           <w:sz w:val="27"/>
         </w:rPr>
-        <w:t>8.1 100 輪法律稽核與 50 輪 UI 測試腳本</w:t>
+        <w:t>8.1 測試腳本開發 Prompt 模板 6</w:t>
       </w:r>
     </w:p>
     <w:p>
@@ -1390,6 +3317,61 @@
           <w:sz w:val="22"/>
         </w:rPr>
         <w:t>撰寫客觀測試腳本進行連環稽核，測試失敗時自動重修，達成 100/100 法律準確度與 50/50 時間軸點擊驗證通過！</w:t>
+      </w:r>
+    </w:p>
+    <w:p>
+      <w:pPr>
+        <w:spacing w:before="200" w:after="80"/>
+        <w:jc w:val="center"/>
+      </w:pPr>
+      <w:r>
+        <w:drawing>
+          <wp:inline xmlns:a="http://schemas.openxmlformats.org/drawingml/2006/main" xmlns:pic="http://schemas.openxmlformats.org/drawingml/2006/picture">
+            <wp:extent cx="5669280" cy="3188970"/>
+            <wp:docPr id="3" name="Picture 3"/>
+            <wp:cNvGraphicFramePr>
+              <a:graphicFrameLocks noChangeAspect="1"/>
+            </wp:cNvGraphicFramePr>
+            <a:graphic>
+              <a:graphicData uri="http://schemas.openxmlformats.org/drawingml/2006/picture">
+                <pic:pic>
+                  <pic:nvPicPr>
+                    <pic:cNvPr id="0" name="test_audit_pass_rate.png"/>
+                    <pic:cNvPicPr/>
+                  </pic:nvPicPr>
+                  <pic:blipFill>
+                    <a:blip r:embed="rId11"/>
+                    <a:stretch>
+                      <a:fillRect/>
+                    </a:stretch>
+                  </pic:blipFill>
+                  <pic:spPr>
+                    <a:xfrm>
+                      <a:off x="0" y="0"/>
+                      <a:ext cx="5669280" cy="3188970"/>
+                    </a:xfrm>
+                    <a:prstGeom prst="rect"/>
+                  </pic:spPr>
+                </pic:pic>
+              </a:graphicData>
+            </a:graphic>
+          </wp:inline>
+        </w:drawing>
+      </w:r>
+    </w:p>
+    <w:p>
+      <w:pPr>
+        <w:spacing w:after="200"/>
+        <w:jc w:val="center"/>
+      </w:pPr>
+      <w:r>
+        <w:rPr>
+          <w:rFonts w:ascii="Microsoft JhengHei" w:hAnsi="Microsoft JhengHei"/>
+          <w:i/>
+          <w:color w:val="2C5282"/>
+          <w:sz w:val="19"/>
+        </w:rPr>
+        <w:t>圖 8.1：10 大核心模組之 100 輪與 50 輪自動化測試 100% 通過率指標圖</w:t>
       </w:r>
     </w:p>
     <w:tbl>
@@ -1431,7 +3413,7 @@
                 <w:color w:val="1B365D"/>
                 <w:sz w:val="22"/>
               </w:rPr>
-              <w:t>[Antigravity 完整提示詞指令模板 (Prompt Template)]  Prompt 模板 6：100 輪法律稽核與 50 輪 UI 測試驗證腳本完整指令</w:t>
+              <w:t>[行政法專案實戰 Prompt 指令範例模板]  【100 輪法律稽核與 50 輪 UI 測試驗證腳本 Prompt 範例模板】</w:t>
               <w:br/>
             </w:r>
             <w:r>
@@ -1460,6 +3442,245 @@
       </w:pPr>
     </w:p>
     <w:p>
+      <w:pPr>
+        <w:keepNext/>
+        <w:spacing w:before="360" w:after="160"/>
+      </w:pPr>
+      <w:r>
+        <w:rPr>
+          <w:rFonts w:ascii="Microsoft JhengHei" w:hAnsi="Microsoft JhengHei"/>
+          <w:b/>
+          <w:color w:val="2C5282"/>
+          <w:sz w:val="27"/>
+        </w:rPr>
+        <w:t>8.2 Prompt 實戰解說與輸入/輸出比對</w:t>
+      </w:r>
+    </w:p>
+    <w:tbl>
+      <w:tblPr>
+        <w:tblW w:type="auto" w:w="0"/>
+        <w:jc w:val="center"/>
+        <w:tblLayout w:type="fixed"/>
+        <w:tblLook w:firstColumn="1" w:firstRow="1" w:lastColumn="0" w:lastRow="0" w:noHBand="0" w:noVBand="1" w:val="04A0"/>
+      </w:tblPr>
+      <w:tblGrid>
+        <w:gridCol w:w="4514"/>
+        <w:gridCol w:w="4514"/>
+      </w:tblGrid>
+      <w:tr>
+        <w:tc>
+          <w:tcPr>
+            <w:tcW w:type="dxa" w:w="4514"/>
+            <w:shd w:fill="1B365D"/>
+            <w:tcMar>
+              <w:top w:w="120" w:type="dxa"/>
+              <w:bottom w:w="120" w:type="dxa"/>
+              <w:left w:w="140" w:type="dxa"/>
+              <w:right w:w="140" w:type="dxa"/>
+            </w:tcMar>
+          </w:tcPr>
+          <w:p>
+            <w:pPr>
+              <w:jc w:val="center"/>
+            </w:pPr>
+            <w:r>
+              <w:rPr>
+                <w:rFonts w:ascii="Microsoft JhengHei" w:hAnsi="Microsoft JhengHei"/>
+                <w:b/>
+                <w:color w:val="FFFFFF"/>
+                <w:sz w:val="20"/>
+              </w:rPr>
+              <w:t>階段比對項目</w:t>
+            </w:r>
+          </w:p>
+        </w:tc>
+        <w:tc>
+          <w:tcPr>
+            <w:tcW w:type="dxa" w:w="4514"/>
+            <w:shd w:fill="1B365D"/>
+            <w:tcMar>
+              <w:top w:w="120" w:type="dxa"/>
+              <w:bottom w:w="120" w:type="dxa"/>
+              <w:left w:w="140" w:type="dxa"/>
+              <w:right w:w="140" w:type="dxa"/>
+            </w:tcMar>
+          </w:tcPr>
+          <w:p>
+            <w:pPr>
+              <w:jc w:val="center"/>
+            </w:pPr>
+            <w:r>
+              <w:rPr>
+                <w:rFonts w:ascii="Microsoft JhengHei" w:hAnsi="Microsoft JhengHei"/>
+                <w:b/>
+                <w:color w:val="FFFFFF"/>
+                <w:sz w:val="20"/>
+              </w:rPr>
+              <w:t>Antigravity AI 運算軌跡與實體產出細節說明</w:t>
+            </w:r>
+          </w:p>
+        </w:tc>
+      </w:tr>
+      <w:tr>
+        <w:tc>
+          <w:tcPr>
+            <w:tcW w:type="dxa" w:w="4514"/>
+            <w:shd w:fill="FFFFFF"/>
+            <w:tcMar>
+              <w:top w:w="100" w:type="dxa"/>
+              <w:bottom w:w="100" w:type="dxa"/>
+              <w:left w:w="140" w:type="dxa"/>
+              <w:right w:w="140" w:type="dxa"/>
+            </w:tcMar>
+          </w:tcPr>
+          <w:p>
+            <w:pPr>
+              <w:jc w:val="center"/>
+            </w:pPr>
+            <w:r>
+              <w:rPr>
+                <w:rFonts w:ascii="Microsoft JhengHei" w:hAnsi="Microsoft JhengHei"/>
+                <w:color w:val="2D3748"/>
+                <w:sz w:val="19"/>
+              </w:rPr>
+              <w:t>📥 使用者輸入 Prompt</w:t>
+            </w:r>
+          </w:p>
+        </w:tc>
+        <w:tc>
+          <w:tcPr>
+            <w:tcW w:type="dxa" w:w="4514"/>
+            <w:shd w:fill="FFFFFF"/>
+            <w:tcMar>
+              <w:top w:w="100" w:type="dxa"/>
+              <w:bottom w:w="100" w:type="dxa"/>
+              <w:left w:w="140" w:type="dxa"/>
+              <w:right w:w="140" w:type="dxa"/>
+            </w:tcMar>
+          </w:tcPr>
+          <w:p>
+            <w:r>
+              <w:rPr>
+                <w:rFonts w:ascii="Microsoft JhengHei" w:hAnsi="Microsoft JhengHei"/>
+                <w:color w:val="2D3748"/>
+                <w:sz w:val="19"/>
+              </w:rPr>
+              <w:t>指定『100 輪法律稽核 Python 腳本』+『50 輪 Node DOM 沙盒 UI 測試』+『Auto-Repair 修復迴圈』</w:t>
+            </w:r>
+          </w:p>
+        </w:tc>
+      </w:tr>
+      <w:tr>
+        <w:tc>
+          <w:tcPr>
+            <w:tcW w:type="dxa" w:w="4514"/>
+            <w:shd w:fill="F8FAFC"/>
+            <w:tcMar>
+              <w:top w:w="100" w:type="dxa"/>
+              <w:bottom w:w="100" w:type="dxa"/>
+              <w:left w:w="140" w:type="dxa"/>
+              <w:right w:w="140" w:type="dxa"/>
+            </w:tcMar>
+          </w:tcPr>
+          <w:p>
+            <w:pPr>
+              <w:jc w:val="center"/>
+            </w:pPr>
+            <w:r>
+              <w:rPr>
+                <w:rFonts w:ascii="Microsoft JhengHei" w:hAnsi="Microsoft JhengHei"/>
+                <w:color w:val="2D3748"/>
+                <w:sz w:val="19"/>
+              </w:rPr>
+              <w:t>⚙️ AI 執行軌跡 (Trajectory)</w:t>
+            </w:r>
+          </w:p>
+        </w:tc>
+        <w:tc>
+          <w:tcPr>
+            <w:tcW w:type="dxa" w:w="4514"/>
+            <w:shd w:fill="F8FAFC"/>
+            <w:tcMar>
+              <w:top w:w="100" w:type="dxa"/>
+              <w:bottom w:w="100" w:type="dxa"/>
+              <w:left w:w="140" w:type="dxa"/>
+              <w:right w:w="140" w:type="dxa"/>
+            </w:tcMar>
+          </w:tcPr>
+          <w:p>
+            <w:r>
+              <w:rPr>
+                <w:rFonts w:ascii="Microsoft JhengHei" w:hAnsi="Microsoft JhengHei"/>
+                <w:color w:val="2D3748"/>
+                <w:sz w:val="19"/>
+              </w:rPr>
+              <w:t>1. 編寫 verify_100_rounds_podcast_legal.py 比對《行政程序法》條號與字號。</w:t>
+              <w:br/>
+              <w:t>2. 編寫 audit_50_dual_host_podcast.js 模擬點擊。</w:t>
+              <w:br/>
+              <w:t>3. 執行測試發現未編碼字元自動修復。</w:t>
+              <w:br/>
+              <w:t>4. 再次執行輸出 100/100 PASSED。</w:t>
+            </w:r>
+          </w:p>
+        </w:tc>
+      </w:tr>
+      <w:tr>
+        <w:tc>
+          <w:tcPr>
+            <w:tcW w:type="dxa" w:w="4514"/>
+            <w:shd w:fill="FFFFFF"/>
+            <w:tcMar>
+              <w:top w:w="100" w:type="dxa"/>
+              <w:bottom w:w="100" w:type="dxa"/>
+              <w:left w:w="140" w:type="dxa"/>
+              <w:right w:w="140" w:type="dxa"/>
+            </w:tcMar>
+          </w:tcPr>
+          <w:p>
+            <w:pPr>
+              <w:jc w:val="center"/>
+            </w:pPr>
+            <w:r>
+              <w:rPr>
+                <w:rFonts w:ascii="Microsoft JhengHei" w:hAnsi="Microsoft JhengHei"/>
+                <w:color w:val="2D3748"/>
+                <w:sz w:val="19"/>
+              </w:rPr>
+              <w:t>📤 實體產出成果 (Output)</w:t>
+            </w:r>
+          </w:p>
+        </w:tc>
+        <w:tc>
+          <w:tcPr>
+            <w:tcW w:type="dxa" w:w="4514"/>
+            <w:shd w:fill="FFFFFF"/>
+            <w:tcMar>
+              <w:top w:w="100" w:type="dxa"/>
+              <w:bottom w:w="100" w:type="dxa"/>
+              <w:left w:w="140" w:type="dxa"/>
+              <w:right w:w="140" w:type="dxa"/>
+            </w:tcMar>
+          </w:tcPr>
+          <w:p>
+            <w:r>
+              <w:rPr>
+                <w:rFonts w:ascii="Microsoft JhengHei" w:hAnsi="Microsoft JhengHei"/>
+                <w:color w:val="2D3748"/>
+                <w:sz w:val="19"/>
+              </w:rPr>
+              <w:t>產出兩套連環測試報告（100/100 Passed &amp; 50/50 Passed），確保專案毫無法理瑕疵與播放卡頓！</w:t>
+            </w:r>
+          </w:p>
+        </w:tc>
+      </w:tr>
+    </w:tbl>
+    <w:p>
+      <w:pPr>
+        <w:spacing w:before="120" w:after="120"/>
+      </w:pPr>
+    </w:p>
+    <w:p>
       <w:r>
         <w:br w:type="page"/>
       </w:r>
@@ -1476,7 +3697,7 @@
           <w:color w:val="1B365D"/>
           <w:sz w:val="34"/>
         </w:rPr>
-        <w:t>第九章：GitHub Pages 線上部署與 Git 版本管理實戰</w:t>
+        <w:t>第九章：GitHub Pages 線上部署與 Git 版本管理實戰 Prompt 範例</w:t>
       </w:r>
     </w:p>
     <w:p>
@@ -1491,7 +3712,7 @@
           <w:color w:val="2C5282"/>
           <w:sz w:val="27"/>
         </w:rPr>
-        <w:t>9.1 Git 部署與 GitHub Pages 免費雲端託管</w:t>
+        <w:t>9.1 Git 部署 Prompt 模板 7</w:t>
       </w:r>
     </w:p>
     <w:p>
@@ -1546,7 +3767,7 @@
                 <w:color w:val="1B365D"/>
                 <w:sz w:val="22"/>
               </w:rPr>
-              <w:t>[Antigravity 完整提示詞指令模板 (Prompt Template)]  Prompt 模板 7：Git 版本管理與 GitHub Pages 雲端部署完整指令</w:t>
+              <w:t>[行政法專案實戰 Prompt 指令範例模板]  【Git 版本管理與 GitHub Pages 雲端部署 Prompt 範例模板】</w:t>
               <w:br/>
             </w:r>
             <w:r>
@@ -1578,6 +3799,245 @@
     <w:p>
       <w:pPr>
         <w:spacing w:before="80" w:after="80"/>
+      </w:pPr>
+    </w:p>
+    <w:p>
+      <w:pPr>
+        <w:keepNext/>
+        <w:spacing w:before="360" w:after="160"/>
+      </w:pPr>
+      <w:r>
+        <w:rPr>
+          <w:rFonts w:ascii="Microsoft JhengHei" w:hAnsi="Microsoft JhengHei"/>
+          <w:b/>
+          <w:color w:val="2C5282"/>
+          <w:sz w:val="27"/>
+        </w:rPr>
+        <w:t>9.2 Prompt 實戰解說與輸入/輸出比對</w:t>
+      </w:r>
+    </w:p>
+    <w:tbl>
+      <w:tblPr>
+        <w:tblW w:type="auto" w:w="0"/>
+        <w:jc w:val="center"/>
+        <w:tblLayout w:type="fixed"/>
+        <w:tblLook w:firstColumn="1" w:firstRow="1" w:lastColumn="0" w:lastRow="0" w:noHBand="0" w:noVBand="1" w:val="04A0"/>
+      </w:tblPr>
+      <w:tblGrid>
+        <w:gridCol w:w="4514"/>
+        <w:gridCol w:w="4514"/>
+      </w:tblGrid>
+      <w:tr>
+        <w:tc>
+          <w:tcPr>
+            <w:tcW w:type="dxa" w:w="4514"/>
+            <w:shd w:fill="1B365D"/>
+            <w:tcMar>
+              <w:top w:w="120" w:type="dxa"/>
+              <w:bottom w:w="120" w:type="dxa"/>
+              <w:left w:w="140" w:type="dxa"/>
+              <w:right w:w="140" w:type="dxa"/>
+            </w:tcMar>
+          </w:tcPr>
+          <w:p>
+            <w:pPr>
+              <w:jc w:val="center"/>
+            </w:pPr>
+            <w:r>
+              <w:rPr>
+                <w:rFonts w:ascii="Microsoft JhengHei" w:hAnsi="Microsoft JhengHei"/>
+                <w:b/>
+                <w:color w:val="FFFFFF"/>
+                <w:sz w:val="20"/>
+              </w:rPr>
+              <w:t>階段比對項目</w:t>
+            </w:r>
+          </w:p>
+        </w:tc>
+        <w:tc>
+          <w:tcPr>
+            <w:tcW w:type="dxa" w:w="4514"/>
+            <w:shd w:fill="1B365D"/>
+            <w:tcMar>
+              <w:top w:w="120" w:type="dxa"/>
+              <w:bottom w:w="120" w:type="dxa"/>
+              <w:left w:w="140" w:type="dxa"/>
+              <w:right w:w="140" w:type="dxa"/>
+            </w:tcMar>
+          </w:tcPr>
+          <w:p>
+            <w:pPr>
+              <w:jc w:val="center"/>
+            </w:pPr>
+            <w:r>
+              <w:rPr>
+                <w:rFonts w:ascii="Microsoft JhengHei" w:hAnsi="Microsoft JhengHei"/>
+                <w:b/>
+                <w:color w:val="FFFFFF"/>
+                <w:sz w:val="20"/>
+              </w:rPr>
+              <w:t>Antigravity AI 運算軌跡與實體產出細節說明</w:t>
+            </w:r>
+          </w:p>
+        </w:tc>
+      </w:tr>
+      <w:tr>
+        <w:tc>
+          <w:tcPr>
+            <w:tcW w:type="dxa" w:w="4514"/>
+            <w:shd w:fill="FFFFFF"/>
+            <w:tcMar>
+              <w:top w:w="100" w:type="dxa"/>
+              <w:bottom w:w="100" w:type="dxa"/>
+              <w:left w:w="140" w:type="dxa"/>
+              <w:right w:w="140" w:type="dxa"/>
+            </w:tcMar>
+          </w:tcPr>
+          <w:p>
+            <w:pPr>
+              <w:jc w:val="center"/>
+            </w:pPr>
+            <w:r>
+              <w:rPr>
+                <w:rFonts w:ascii="Microsoft JhengHei" w:hAnsi="Microsoft JhengHei"/>
+                <w:color w:val="2D3748"/>
+                <w:sz w:val="19"/>
+              </w:rPr>
+              <w:t>📥 使用者輸入 Prompt</w:t>
+            </w:r>
+          </w:p>
+        </w:tc>
+        <w:tc>
+          <w:tcPr>
+            <w:tcW w:type="dxa" w:w="4514"/>
+            <w:shd w:fill="FFFFFF"/>
+            <w:tcMar>
+              <w:top w:w="100" w:type="dxa"/>
+              <w:bottom w:w="100" w:type="dxa"/>
+              <w:left w:w="140" w:type="dxa"/>
+              <w:right w:w="140" w:type="dxa"/>
+            </w:tcMar>
+          </w:tcPr>
+          <w:p>
+            <w:r>
+              <w:rPr>
+                <w:rFonts w:ascii="Microsoft JhengHei" w:hAnsi="Microsoft JhengHei"/>
+                <w:color w:val="2D3748"/>
+                <w:sz w:val="19"/>
+              </w:rPr>
+              <w:t>指定『git add -f 強制追蹤音訊』+『git commit &amp; push』+『GitHub Pages 免費部署指引』</w:t>
+            </w:r>
+          </w:p>
+        </w:tc>
+      </w:tr>
+      <w:tr>
+        <w:tc>
+          <w:tcPr>
+            <w:tcW w:type="dxa" w:w="4514"/>
+            <w:shd w:fill="F8FAFC"/>
+            <w:tcMar>
+              <w:top w:w="100" w:type="dxa"/>
+              <w:bottom w:w="100" w:type="dxa"/>
+              <w:left w:w="140" w:type="dxa"/>
+              <w:right w:w="140" w:type="dxa"/>
+            </w:tcMar>
+          </w:tcPr>
+          <w:p>
+            <w:pPr>
+              <w:jc w:val="center"/>
+            </w:pPr>
+            <w:r>
+              <w:rPr>
+                <w:rFonts w:ascii="Microsoft JhengHei" w:hAnsi="Microsoft JhengHei"/>
+                <w:color w:val="2D3748"/>
+                <w:sz w:val="19"/>
+              </w:rPr>
+              <w:t>⚙️ AI 執行軌跡 (Trajectory)</w:t>
+            </w:r>
+          </w:p>
+        </w:tc>
+        <w:tc>
+          <w:tcPr>
+            <w:tcW w:type="dxa" w:w="4514"/>
+            <w:shd w:fill="F8FAFC"/>
+            <w:tcMar>
+              <w:top w:w="100" w:type="dxa"/>
+              <w:bottom w:w="100" w:type="dxa"/>
+              <w:left w:w="140" w:type="dxa"/>
+              <w:right w:w="140" w:type="dxa"/>
+            </w:tcMar>
+          </w:tcPr>
+          <w:p>
+            <w:r>
+              <w:rPr>
+                <w:rFonts w:ascii="Microsoft JhengHei" w:hAnsi="Microsoft JhengHei"/>
+                <w:color w:val="2D3748"/>
+                <w:sz w:val="19"/>
+              </w:rPr>
+              <w:t>1. 執行 git status 掃描異動檔案。</w:t>
+              <w:br/>
+              <w:t>2. 執行 git add -f 將 9.18MB MP3 檔案強制納入追蹤。</w:t>
+              <w:br/>
+              <w:t>3. 執行 git commit 與 git push 上傳。</w:t>
+              <w:br/>
+              <w:t>4. 輸出 GitHub Pages 上線設定教學。</w:t>
+            </w:r>
+          </w:p>
+        </w:tc>
+      </w:tr>
+      <w:tr>
+        <w:tc>
+          <w:tcPr>
+            <w:tcW w:type="dxa" w:w="4514"/>
+            <w:shd w:fill="FFFFFF"/>
+            <w:tcMar>
+              <w:top w:w="100" w:type="dxa"/>
+              <w:bottom w:w="100" w:type="dxa"/>
+              <w:left w:w="140" w:type="dxa"/>
+              <w:right w:w="140" w:type="dxa"/>
+            </w:tcMar>
+          </w:tcPr>
+          <w:p>
+            <w:pPr>
+              <w:jc w:val="center"/>
+            </w:pPr>
+            <w:r>
+              <w:rPr>
+                <w:rFonts w:ascii="Microsoft JhengHei" w:hAnsi="Microsoft JhengHei"/>
+                <w:color w:val="2D3748"/>
+                <w:sz w:val="19"/>
+              </w:rPr>
+              <w:t>📤 實體產出成果 (Output)</w:t>
+            </w:r>
+          </w:p>
+        </w:tc>
+        <w:tc>
+          <w:tcPr>
+            <w:tcW w:type="dxa" w:w="4514"/>
+            <w:shd w:fill="FFFFFF"/>
+            <w:tcMar>
+              <w:top w:w="100" w:type="dxa"/>
+              <w:bottom w:w="100" w:type="dxa"/>
+              <w:left w:w="140" w:type="dxa"/>
+              <w:right w:w="140" w:type="dxa"/>
+            </w:tcMar>
+          </w:tcPr>
+          <w:p>
+            <w:r>
+              <w:rPr>
+                <w:rFonts w:ascii="Microsoft JhengHei" w:hAnsi="Microsoft JhengHei"/>
+                <w:color w:val="2D3748"/>
+                <w:sz w:val="19"/>
+              </w:rPr>
+              <w:t>完成 GitHub 雲端託管，獲得 HTTPS 全球免費線上播放網址（如 https://mchung2022.github.io/administrative-law-slides/podcast_player.html）！</w:t>
+            </w:r>
+          </w:p>
+        </w:tc>
+      </w:tr>
+    </w:tbl>
+    <w:p>
+      <w:pPr>
+        <w:spacing w:before="120" w:after="120"/>
       </w:pPr>
     </w:p>
     <w:p>
@@ -1729,7 +4189,495 @@
                 <w:color w:val="2D3748"/>
                 <w:sz w:val="20"/>
               </w:rPr>
-              <w:t>恭喜您完整研讀本講義！您已掌握與 Antigravity AI 協作開發 500 頁 HTML 簡報、講稿全集與 30 分鐘廣播 Podcast 的全部核心技術與 7 大階段完整 Prompt 提示詞指令。快去開啟您的下一個 AI 協作專案吧！</w:t>
+              <w:t>恭喜您完整研讀本講義！您已掌握與 Antigravity AI 協作開發 500 頁 HTML 簡報、講稿全集與 30 分鐘廣播 Podcast 的全部核心技術、7 大階段完整 Prompt 提示詞指令與實戰輸入/輸出比對說明。快去開啟您的下一個 AI 協作專案吧！</w:t>
+            </w:r>
+          </w:p>
+        </w:tc>
+      </w:tr>
+    </w:tbl>
+    <w:p>
+      <w:pPr>
+        <w:spacing w:before="80" w:after="80"/>
+      </w:pPr>
+    </w:p>
+    <w:p>
+      <w:pPr>
+        <w:keepNext/>
+        <w:spacing w:before="360" w:after="160"/>
+      </w:pPr>
+      <w:r>
+        <w:rPr>
+          <w:rFonts w:ascii="Microsoft JhengHei" w:hAnsi="Microsoft JhengHei"/>
+          <w:b/>
+          <w:color w:val="2C5282"/>
+          <w:sz w:val="27"/>
+        </w:rPr>
+        <w:t>3.3 行政法 HTML 簡報資料結構 (slidesData.js) 實戰代碼解析</w:t>
+      </w:r>
+    </w:p>
+    <w:p>
+      <w:pPr>
+        <w:spacing w:after="140" w:line="300" w:lineRule="auto"/>
+      </w:pPr>
+      <w:r>
+        <w:rPr>
+          <w:rFonts w:ascii="Microsoft JhengHei" w:hAnsi="Microsoft JhengHei"/>
+          <w:color w:val="2D3748"/>
+          <w:sz w:val="22"/>
+        </w:rPr>
+        <w:t>在行政法簡報系統中，全數 500 頁內容均經由 Prompt 模板 1 引導 AI 結構化輸出至 js/slidesData.js 中。以下為真實範例資料格式：</w:t>
+      </w:r>
+    </w:p>
+    <w:tbl>
+      <w:tblPr>
+        <w:tblW w:type="auto" w:w="0"/>
+        <w:jc w:val="center"/>
+        <w:tblLayout w:type="fixed"/>
+        <w:tblLook w:firstColumn="1" w:firstRow="1" w:lastColumn="0" w:lastRow="0" w:noHBand="0" w:noVBand="1" w:val="04A0"/>
+      </w:tblPr>
+      <w:tblGrid>
+        <w:gridCol w:w="9029"/>
+      </w:tblGrid>
+      <w:tr>
+        <w:tc>
+          <w:tcPr>
+            <w:tcW w:type="dxa" w:w="9029"/>
+            <w:tcMar>
+              <w:top w:w="100" w:type="dxa"/>
+              <w:bottom w:w="100" w:type="dxa"/>
+              <w:left w:w="180" w:type="dxa"/>
+              <w:right w:w="180" w:type="dxa"/>
+            </w:tcMar>
+            <w:shd w:fill="1E293B"/>
+            <w:tcBorders>
+              <w:top w:val="single" w:sz="6" w:space="0" w:color="334155"/>
+              <w:left w:val="single" w:sz="6" w:space="0" w:color="334155"/>
+              <w:bottom w:val="single" w:sz="6" w:space="0" w:color="334155"/>
+              <w:right w:val="single" w:sz="6" w:space="0" w:color="334155"/>
+            </w:tcBorders>
+          </w:tcPr>
+          <w:p>
+            <w:pPr>
+              <w:spacing w:after="40"/>
+            </w:pPr>
+            <w:r>
+              <w:rPr>
+                <w:rFonts w:ascii="Consolas" w:hAnsi="Consolas"/>
+                <w:color w:val="E2E8F0"/>
+                <w:sz w:val="19"/>
+              </w:rPr>
+              <w:t>// js/slidesData.js 行政法真實範例代碼</w:t>
+              <w:br/>
+              <w:t>const slidesData = [</w:t>
+              <w:br/>
+              <w:t xml:space="preserve">  {</w:t>
+              <w:br/>
+              <w:t xml:space="preserve">    "id": 1,</w:t>
+              <w:br/>
+              <w:t xml:space="preserve">    "module": "Module 1: 行政與行政法概論",</w:t>
+              <w:br/>
+              <w:t xml:space="preserve">    "type": "concept",</w:t>
+              <w:br/>
+              <w:t xml:space="preserve">    "category": "108課綱核心觀念",</w:t>
+              <w:br/>
+              <w:t xml:space="preserve">    "title": "Slide 1: 行政之概念與公私法行為劃分",</w:t>
+              <w:br/>
+              <w:t xml:space="preserve">    "subtitle": "公權力行政 vs 私經濟國庫行政與給付行政理念",</w:t>
+              <w:br/>
+              <w:t xml:space="preserve">    "content": "行政機關為達成行政目的，得選擇採取公法或私法行為。若屬公權力干涉，一律受公法嚴格拘束...",</w:t>
+              <w:br/>
+              <w:t xml:space="preserve">    "caseStudy": {</w:t>
+              <w:br/>
+              <w:t xml:space="preserve">      "title": "新聞案例：高鐵採購案與政府採購法適用爭議",</w:t>
+              <w:br/>
+              <w:t xml:space="preserve">      "context": "📜 一、事件脈絡：交通部高鐵局辦理車站周邊開發採購案，與私法人簽訂開發契約...",</w:t>
+              <w:br/>
+              <w:t xml:space="preserve">      "dispute": "⚖️ 二、法律爭點：政府採購行為究竟屬於私法國庫行政，抑或公權力行政？",</w:t>
+              <w:br/>
+              <w:t xml:space="preserve">      "examPoints": "🎯 三、大考考點：實務見解認為招標決標屬公法處分；履約爭議則屬民法私法契約爭點！"</w:t>
+              <w:br/>
+              <w:t xml:space="preserve">    },</w:t>
+              <w:br/>
+              <w:t xml:space="preserve">    "podcastScript": "【阿哲】：小晨老師，政府買高鐵設備算公法還是私法啊？【小晨】：這要看階段...",</w:t>
+              <w:br/>
+              <w:t xml:space="preserve">    "notes": "重點提示：區分公私法雙階理論（Zweistufentheorie）在政府採購法之應用。"</w:t>
+              <w:br/>
+              <w:t xml:space="preserve">  }</w:t>
+              <w:br/>
+              <w:t>];</w:t>
+            </w:r>
+          </w:p>
+        </w:tc>
+      </w:tr>
+    </w:tbl>
+    <w:p>
+      <w:pPr>
+        <w:spacing w:before="80" w:after="80"/>
+      </w:pPr>
+    </w:p>
+    <w:p>
+      <w:pPr>
+        <w:keepNext/>
+        <w:spacing w:before="360" w:after="160"/>
+      </w:pPr>
+      <w:r>
+        <w:rPr>
+          <w:rFonts w:ascii="Microsoft JhengHei" w:hAnsi="Microsoft JhengHei"/>
+          <w:b/>
+          <w:color w:val="2C5282"/>
+          <w:sz w:val="27"/>
+        </w:rPr>
+        <w:t>5.5 行政法 30 分鐘 Podcast 對白 JSON (podcast_script_30min.json) 代碼實例</w:t>
+      </w:r>
+    </w:p>
+    <w:p>
+      <w:pPr>
+        <w:spacing w:after="140" w:line="300" w:lineRule="auto"/>
+      </w:pPr>
+      <w:r>
+        <w:rPr>
+          <w:rFonts w:ascii="Microsoft JhengHei" w:hAnsi="Microsoft JhengHei"/>
+          <w:color w:val="2D3748"/>
+          <w:sz w:val="22"/>
+        </w:rPr>
+        <w:t>Prompt 模板 3 引導 AI 產出的 13,000 餘字廣播對白，精確結構化為 JSON 檔，供語音合成腳本調用：</w:t>
+      </w:r>
+    </w:p>
+    <w:tbl>
+      <w:tblPr>
+        <w:tblW w:type="auto" w:w="0"/>
+        <w:jc w:val="center"/>
+        <w:tblLayout w:type="fixed"/>
+        <w:tblLook w:firstColumn="1" w:firstRow="1" w:lastColumn="0" w:lastRow="0" w:noHBand="0" w:noVBand="1" w:val="04A0"/>
+      </w:tblPr>
+      <w:tblGrid>
+        <w:gridCol w:w="9029"/>
+      </w:tblGrid>
+      <w:tr>
+        <w:tc>
+          <w:tcPr>
+            <w:tcW w:type="dxa" w:w="9029"/>
+            <w:tcMar>
+              <w:top w:w="100" w:type="dxa"/>
+              <w:bottom w:w="100" w:type="dxa"/>
+              <w:left w:w="180" w:type="dxa"/>
+              <w:right w:w="180" w:type="dxa"/>
+            </w:tcMar>
+            <w:shd w:fill="1E293B"/>
+            <w:tcBorders>
+              <w:top w:val="single" w:sz="6" w:space="0" w:color="334155"/>
+              <w:left w:val="single" w:sz="6" w:space="0" w:color="334155"/>
+              <w:bottom w:val="single" w:sz="6" w:space="0" w:color="334155"/>
+              <w:right w:val="single" w:sz="6" w:space="0" w:color="334155"/>
+            </w:tcBorders>
+          </w:tcPr>
+          <w:p>
+            <w:pPr>
+              <w:spacing w:after="40"/>
+            </w:pPr>
+            <w:r>
+              <w:rPr>
+                <w:rFonts w:ascii="Consolas" w:hAnsi="Consolas"/>
+                <w:color w:val="E2E8F0"/>
+                <w:sz w:val="19"/>
+              </w:rPr>
+              <w:t>// scratch/podcast_script_30min.json 真實對白 JSON 範例</w:t>
+              <w:br/>
+              <w:t>[</w:t>
+              <w:br/>
+              <w:t xml:space="preserve">  {</w:t>
+              <w:br/>
+              <w:t xml:space="preserve">    "id": 1,</w:t>
+              <w:br/>
+              <w:t xml:space="preserve">    "time": "00:00 - 03:00",</w:t>
+              <w:br/>
+              <w:t xml:space="preserve">    "title": "Module 1：節目開場與行政法基本概念與現代法治國",</w:t>
+              <w:br/>
+              <w:t xml:space="preserve">    "topic": "公權力行政 vs 私經濟國庫行政與給付行政理念",</w:t>
+              <w:br/>
+              <w:t xml:space="preserve">    "lines": [</w:t>
+              <w:br/>
+              <w:t xml:space="preserve">      {</w:t>
+              <w:br/>
+              <w:t xml:space="preserve">        "speaker": "阿哲",</w:t>
+              <w:br/>
+              <w:t xml:space="preserve">        "voice": "zh-TW-YunJheNeural",</w:t>
+              <w:br/>
+              <w:t xml:space="preserve">        "text": "哈囉！各位同學、法學愛好者與各大考試的考生們，大家辛苦了！歡迎收聽《行政法 500 頁旗艦總複習——30 分鐘特企 Podcast 廣播對談講堂》！我是廣播主持人阿哲。"</w:t>
+              <w:br/>
+              <w:t xml:space="preserve">      },</w:t>
+              <w:br/>
+              <w:t xml:space="preserve">      {</w:t>
+              <w:br/>
+              <w:t xml:space="preserve">        "speaker": "小晨",</w:t>
+              <w:br/>
+              <w:t xml:space="preserve">        "voice": "zh-TW-HsiaoChenNeural",</w:t>
+              <w:br/>
+              <w:t xml:space="preserve">        "text": "嗨，大家午安！我是你們的法治導師小晨。今天這集整整 30 分鐘的精華廣播特輯，是我們團隊特別濃縮出來最輕鬆、最白話、最貼近大考命題脈絡的雙主持人廣播對談！"</w:t>
+              <w:br/>
+              <w:t xml:space="preserve">      }</w:t>
+              <w:br/>
+              <w:t xml:space="preserve">    ]</w:t>
+              <w:br/>
+              <w:t xml:space="preserve">  }</w:t>
+              <w:br/>
+              <w:t>]</w:t>
+            </w:r>
+          </w:p>
+        </w:tc>
+      </w:tr>
+    </w:tbl>
+    <w:p>
+      <w:pPr>
+        <w:spacing w:before="80" w:after="80"/>
+      </w:pPr>
+    </w:p>
+    <w:p>
+      <w:pPr>
+        <w:keepNext/>
+        <w:spacing w:before="360" w:after="160"/>
+      </w:pPr>
+      <w:r>
+        <w:rPr>
+          <w:rFonts w:ascii="Microsoft JhengHei" w:hAnsi="Microsoft JhengHei"/>
+          <w:b/>
+          <w:color w:val="2C5282"/>
+          <w:sz w:val="27"/>
+        </w:rPr>
+        <w:t>6.3 Python edge-tts 雙神經語音合成腳本 (synthesize_dual_host_robust.py) 實體代碼</w:t>
+      </w:r>
+    </w:p>
+    <w:p>
+      <w:pPr>
+        <w:spacing w:after="140" w:line="300" w:lineRule="auto"/>
+      </w:pPr>
+      <w:r>
+        <w:rPr>
+          <w:rFonts w:ascii="Microsoft JhengHei" w:hAnsi="Microsoft JhengHei"/>
+          <w:color w:val="2D3748"/>
+          <w:sz w:val="22"/>
+        </w:rPr>
+        <w:t>Prompt 模板 4 引導 AI 撰寫的具備連線重試與 rate='-15%' 語速控制的 Python 語音合成腳本：</w:t>
+      </w:r>
+    </w:p>
+    <w:tbl>
+      <w:tblPr>
+        <w:tblW w:type="auto" w:w="0"/>
+        <w:jc w:val="center"/>
+        <w:tblLayout w:type="fixed"/>
+        <w:tblLook w:firstColumn="1" w:firstRow="1" w:lastColumn="0" w:lastRow="0" w:noHBand="0" w:noVBand="1" w:val="04A0"/>
+      </w:tblPr>
+      <w:tblGrid>
+        <w:gridCol w:w="9029"/>
+      </w:tblGrid>
+      <w:tr>
+        <w:tc>
+          <w:tcPr>
+            <w:tcW w:type="dxa" w:w="9029"/>
+            <w:tcMar>
+              <w:top w:w="100" w:type="dxa"/>
+              <w:bottom w:w="100" w:type="dxa"/>
+              <w:left w:w="180" w:type="dxa"/>
+              <w:right w:w="180" w:type="dxa"/>
+            </w:tcMar>
+            <w:shd w:fill="1E293B"/>
+            <w:tcBorders>
+              <w:top w:val="single" w:sz="6" w:space="0" w:color="334155"/>
+              <w:left w:val="single" w:sz="6" w:space="0" w:color="334155"/>
+              <w:bottom w:val="single" w:sz="6" w:space="0" w:color="334155"/>
+              <w:right w:val="single" w:sz="6" w:space="0" w:color="334155"/>
+            </w:tcBorders>
+          </w:tcPr>
+          <w:p>
+            <w:pPr>
+              <w:spacing w:after="40"/>
+            </w:pPr>
+            <w:r>
+              <w:rPr>
+                <w:rFonts w:ascii="Consolas" w:hAnsi="Consolas"/>
+                <w:color w:val="E2E8F0"/>
+                <w:sz w:val="19"/>
+              </w:rPr>
+              <w:t># scratch/synthesize_dual_host_robust.py 真實代碼範例</w:t>
+              <w:br/>
+              <w:t>import os, json, asyncio, edge_tts</w:t>
+              <w:br/>
+              <w:br/>
+              <w:t>async def speak_with_retry(clean_text, voice, line_mp3, rate="-15%"):</w:t>
+              <w:br/>
+              <w:t xml:space="preserve">    for attempt in range(5):</w:t>
+              <w:br/>
+              <w:t xml:space="preserve">        try:</w:t>
+              <w:br/>
+              <w:t xml:space="preserve">            comm = edge_tts.Communicate(clean_text, voice, rate=rate)</w:t>
+              <w:br/>
+              <w:t xml:space="preserve">            await comm.save(line_mp3)</w:t>
+              <w:br/>
+              <w:t xml:space="preserve">            return True</w:t>
+              <w:br/>
+              <w:t xml:space="preserve">        except Exception as e:</w:t>
+              <w:br/>
+              <w:t xml:space="preserve">            print(f"Retry {attempt+1}/5 for {line_mp3} due to: {e}")</w:t>
+              <w:br/>
+              <w:t xml:space="preserve">            await asyncio.sleep(1.0)</w:t>
+              <w:br/>
+              <w:t xml:space="preserve">    return False</w:t>
+            </w:r>
+          </w:p>
+        </w:tc>
+      </w:tr>
+    </w:tbl>
+    <w:p>
+      <w:pPr>
+        <w:spacing w:before="80" w:after="80"/>
+      </w:pPr>
+    </w:p>
+    <w:p>
+      <w:pPr>
+        <w:keepNext/>
+        <w:spacing w:before="360" w:after="160"/>
+      </w:pPr>
+      <w:r>
+        <w:rPr>
+          <w:rFonts w:ascii="Microsoft JhengHei" w:hAnsi="Microsoft JhengHei"/>
+          <w:b/>
+          <w:color w:val="2C5282"/>
+          <w:sz w:val="27"/>
+        </w:rPr>
+        <w:t>8.3 100 輪行政法稽核腳本 (verify_100_rounds_podcast_legal.py) 實體代碼</w:t>
+      </w:r>
+    </w:p>
+    <w:p>
+      <w:pPr>
+        <w:spacing w:after="140" w:line="300" w:lineRule="auto"/>
+      </w:pPr>
+      <w:r>
+        <w:rPr>
+          <w:rFonts w:ascii="Microsoft JhengHei" w:hAnsi="Microsoft JhengHei"/>
+          <w:color w:val="2D3748"/>
+          <w:sz w:val="22"/>
+        </w:rPr>
+        <w:t>Prompt 模板 6 引導 AI 產出的 100 輪臺灣法律條文與法理交叉審查 Python 測試腳本：</w:t>
+      </w:r>
+    </w:p>
+    <w:tbl>
+      <w:tblPr>
+        <w:tblW w:type="auto" w:w="0"/>
+        <w:jc w:val="center"/>
+        <w:tblLayout w:type="fixed"/>
+        <w:tblLook w:firstColumn="1" w:firstRow="1" w:lastColumn="0" w:lastRow="0" w:noHBand="0" w:noVBand="1" w:val="04A0"/>
+      </w:tblPr>
+      <w:tblGrid>
+        <w:gridCol w:w="9029"/>
+      </w:tblGrid>
+      <w:tr>
+        <w:tc>
+          <w:tcPr>
+            <w:tcW w:type="dxa" w:w="9029"/>
+            <w:tcMar>
+              <w:top w:w="100" w:type="dxa"/>
+              <w:bottom w:w="100" w:type="dxa"/>
+              <w:left w:w="180" w:type="dxa"/>
+              <w:right w:w="180" w:type="dxa"/>
+            </w:tcMar>
+            <w:shd w:fill="1E293B"/>
+            <w:tcBorders>
+              <w:top w:val="single" w:sz="6" w:space="0" w:color="334155"/>
+              <w:left w:val="single" w:sz="6" w:space="0" w:color="334155"/>
+              <w:bottom w:val="single" w:sz="6" w:space="0" w:color="334155"/>
+              <w:right w:val="single" w:sz="6" w:space="0" w:color="334155"/>
+            </w:tcBorders>
+          </w:tcPr>
+          <w:p>
+            <w:pPr>
+              <w:spacing w:after="40"/>
+            </w:pPr>
+            <w:r>
+              <w:rPr>
+                <w:rFonts w:ascii="Consolas" w:hAnsi="Consolas"/>
+                <w:color w:val="E2E8F0"/>
+                <w:sz w:val="19"/>
+              </w:rPr>
+              <w:t># scratch/verify_100_rounds_podcast_legal.py 真實測試代碼</w:t>
+              <w:br/>
+              <w:t>import json, os</w:t>
+              <w:br/>
+              <w:br/>
+              <w:t>module_legal_audit_dict = {</w:t>
+              <w:br/>
+              <w:t xml:space="preserve">    1: ["公權力行政", "私經濟國庫行政", "給付行政", "依法行政原則"],</w:t>
+              <w:br/>
+              <w:t xml:space="preserve">    2: ["依法行政原則", "法律優位原則", "第 4 條", "法律保留原則", "釋字第 443 號"],</w:t>
+              <w:br/>
+              <w:t xml:space="preserve">    3: ["平等原則", "第 6 條", "比例原則", "第 7 條", "適當性", "必要性", "狹義比例性"],</w:t>
+              <w:br/>
+              <w:t xml:space="preserve">    7: ["行政罰法", "第 24 條", "一行為不二罰", "刑事優先原則", "第 7 條", "故意過失"],</w:t>
+              <w:br/>
+              <w:t xml:space="preserve">    10: ["國家賠償法", "第 3 條", "無過失賠償責任", "第 2 條", "協議先行程序"]</w:t>
+              <w:br/>
+              <w:t>}</w:t>
+              <w:br/>
+              <w:br/>
+              <w:t># 執行 100 輪迴圈驗證，確保 100/100 PASSED！</w:t>
+            </w:r>
+          </w:p>
+        </w:tc>
+      </w:tr>
+    </w:tbl>
+    <w:p>
+      <w:pPr>
+        <w:spacing w:before="80" w:after="80"/>
+      </w:pPr>
+    </w:p>
+    <w:tbl>
+      <w:tblPr>
+        <w:tblW w:type="auto" w:w="0"/>
+        <w:jc w:val="center"/>
+        <w:tblLayout w:type="fixed"/>
+        <w:tblLook w:firstColumn="1" w:firstRow="1" w:lastColumn="0" w:lastRow="0" w:noHBand="0" w:noVBand="1" w:val="04A0"/>
+      </w:tblPr>
+      <w:tblGrid>
+        <w:gridCol w:w="9029"/>
+      </w:tblGrid>
+      <w:tr>
+        <w:tc>
+          <w:tcPr>
+            <w:tcW w:type="dxa" w:w="9029"/>
+            <w:tcMar>
+              <w:top w:w="140" w:type="dxa"/>
+              <w:bottom w:w="140" w:type="dxa"/>
+              <w:left w:w="200" w:type="dxa"/>
+              <w:right w:w="200" w:type="dxa"/>
+            </w:tcMar>
+            <w:shd w:fill="EFF6FF"/>
+            <w:tcBorders>
+              <w:top w:val="none"/>
+              <w:left w:val="single" w:sz="36" w:space="0" w:color="2563EB"/>
+              <w:bottom w:val="none"/>
+              <w:right w:val="none"/>
+            </w:tcBorders>
+          </w:tcPr>
+          <w:p>
+            <w:pPr>
+              <w:spacing w:after="80"/>
+            </w:pPr>
+            <w:r>
+              <w:rPr>
+                <w:rFonts w:ascii="Microsoft JhengHei" w:hAnsi="Microsoft JhengHei"/>
+                <w:b/>
+                <w:color w:val="1B365D"/>
+                <w:sz w:val="22"/>
+              </w:rPr>
+              <w:t>[實務技巧與最佳做法]  祝賀完成 Antigravity AI 實戰學習</w:t>
+              <w:br/>
+            </w:r>
+            <w:r>
+              <w:rPr>
+                <w:rFonts w:ascii="Microsoft JhengHei" w:hAnsi="Microsoft JhengHei"/>
+                <w:color w:val="2D3748"/>
+                <w:sz w:val="20"/>
+              </w:rPr>
+              <w:t>恭喜您完整研讀本講義！您已掌握與 Antigravity AI 協作開發 500 頁 HTML 簡報、講稿全集與 30 分鐘廣播 Podcast 的全部核心技術、7 大階段完整行政法實戰 Prompt 提示詞指令與輸入/輸出比對說明。快去開啟您的下一個 AI 協作專案吧！</w:t>
             </w:r>
           </w:p>
         </w:tc>

</xml_diff>